<commit_message>
feat: Incentive Testing v1.1 — category entry point mapping
Adds the procedure for deriving the events the event-reset rule depends
on, rather than listing them by instinct: buyer-side enumeration, weight
by how much of the decision each occasion re-opens, mark observability,
route observable ones to triggers and unobservable high-value ones out
of the incentive budget as a retrieval problem.

States the boundary the spend is most often oversold across — an
incentive converts at an entry point, it does not create retrieval at
one — and notes that CEP-prompted recall is memory measurement, so it
stays admissible under the parent standard's L1. Retrieval diagnostic
added to test design; lint rule I13. Workbook updated to match (Step 2
map + output table, Step 5 diagnostic, lint set I1-I13).

Co-Authored-By: Claude Fable 5 <noreply@anthropic.com>
</commit_message>
<xml_diff>
--- a/Incentive_Test_Workbook.docx
+++ b/Incentive_Test_Workbook.docx
@@ -29,7 +29,7 @@
           <w:sz w:val="19"/>
           <w:szCs w:val="19"/>
         </w:rPr>
-        <w:t xml:space="preserve">v1 — in Simplified Technical English. One incentive mechanic (or one comparable set), one pass through this workbook. Output: a scored, costed offer, a pre-registered experiment, and calibrated parameters that transfer to every future incentive decision.</w:t>
+        <w:t xml:space="preserve">v1.1 — category entry point mapping added to Step 2 (derive the events, do not list them) and a retrieval diagnostic to Step 5; lint set now I1-I13. In Simplified Technical English. One incentive mechanic (or one comparable set), one pass through this workbook. Output: a scored, costed offer, a pre-registered experiment, and calibrated parameters that transfer to every future incentive decision.</w:t>
       </w:r>
     </w:p>
     <w:p>
@@ -302,7 +302,7 @@
                 <w:sz w:val="20"/>
                 <w:szCs w:val="20"/>
               </w:rPr>
-              <w:t xml:space="preserve">5. End your reply with SELF-CHECK: list the lint rules (I1-I12) this step can break, and give pass or fail for each.</w:t>
+              <w:t xml:space="preserve">5. End your reply with SELF-CHECK: list the lint rules (I1-I13) this step can break, and give pass or fail for each.</w:t>
             </w:r>
           </w:p>
         </w:tc>
@@ -342,7 +342,7 @@
         <w:t xml:space="preserve">1. Self-check — same chat. </w:t>
       </w:r>
       <w:r>
-        <w:t xml:space="preserve">The SELF-CHECK line makes Copilot lint its own output against I1-I12 at the end of every step.</w:t>
+        <w:t xml:space="preserve">The SELF-CHECK line makes Copilot lint its own output against I1-I13 at the end of every step.</w:t>
       </w:r>
     </w:p>
     <w:p>
@@ -357,7 +357,7 @@
         <w:t xml:space="preserve">2. Independent check — new chat. </w:t>
       </w:r>
       <w:r>
-        <w:t xml:space="preserve">For the final test plan, open a new chat, attach the standard and the filled workbook, and write: "Run lint rules I1-I12 on this incentive test plan. Report each failure by rule number."</w:t>
+        <w:t xml:space="preserve">For the final test plan, open a new chat, attach the standard and the filled workbook, and write: "Run lint rules I1-I13 on this incentive test plan. Report each failure by rule number."</w:t>
       </w:r>
     </w:p>
     <w:p>
@@ -1090,7 +1090,27 @@
         <w:t xml:space="preserve">Score B against the anchors </w:t>
       </w:r>
       <w:r>
-        <w:t xml:space="preserve">(1.0 slots-in-unchanged or routine-being-re-decided · 0.6 moderate habit change · 0.3 abandon-and-relearn), with one sentence of justification (I10). Apply the event-reset rule: offers timed to category entry, renewal, refinancing or failure meet no drag.</w:t>
+        <w:t xml:space="preserve">(1.0 slots-in-unchanged or routine-being-re-decided · 0.6 moderate habit change · 0.3 abandon-and-relearn), with one sentence of justification (I10). Apply the event-reset rule: offers timed to an event that re-opens the routine meet no drag.</w:t>
+      </w:r>
+    </w:p>
+    <w:p>
+      <w:pPr>
+        <w:pStyle w:val="ListParagraph"/>
+        <w:numPr>
+          <w:ilvl w:val="0"/>
+          <w:numId w:val="4"/>
+        </w:numPr>
+        <w:spacing w:after="80"/>
+      </w:pPr>
+      <w:r>
+        <w:rPr>
+          <w:b/>
+          <w:bCs/>
+        </w:rPr>
+        <w:t xml:space="preserve">Derive the events — do not list them by instinct (I13). </w:t>
+      </w:r>
+      <w:r>
+        <w:t xml:space="preserve">Map the category entry points: enumerate from the buyer's side the occasions when the category need arises (what just changed, what are they doing, who is with them). Weight each by how much of the decision it re-opens. Mark observability: our data, partner data, public registry, or not observable. Observable occasions become the trigger list. Unobservable high-value occasions are a retrieval problem — route them to brand and distribution, out of this budget.</w:t>
       </w:r>
     </w:p>
     <w:p>
@@ -1196,7 +1216,33 @@
                 <w:sz w:val="20"/>
                 <w:szCs w:val="20"/>
               </w:rPr>
-              <w:t xml:space="preserve">STEP 2. Offer terms from Step 1. Confirm V and C are pinned by design (redesign if not). Score B against the anchors with one sentence of justification, applying the event-reset rule. Classify targeting as observed state or predicted propensity; if propensity, show the base-rate x lift precision arithmetic. Run the customer gate: deflated offer value vs compliance cost.</w:t>
+              <w:t xml:space="preserve">STEP 2. Offer terms from Step 1. Confirm V and C are pinned by design (redesign if not). Score B against the anchors with one sentence of justification, applying the event-reset rule.</w:t>
+            </w:r>
+          </w:p>
+          <w:p>
+            <w:pPr>
+              <w:spacing w:after="40"/>
+            </w:pPr>
+            <w:r>
+              <w:rPr>
+                <w:rFonts w:ascii="Consolas" w:cs="Consolas" w:eastAsia="Consolas" w:hAnsi="Consolas"/>
+                <w:sz w:val="20"/>
+                <w:szCs w:val="20"/>
+              </w:rPr>
+              <w:t xml:space="preserve">Then map the category entry points: enumerate buyer-side the occasions when the category need arises, weight each by how much of the decision it re-opens, and mark observability (our data / partner data / public registry / not observable). Route observable ones to the trigger list; route unobservable high-value ones out of this budget as a retrieval problem.</w:t>
+            </w:r>
+          </w:p>
+          <w:p>
+            <w:pPr>
+              <w:spacing w:after="40"/>
+            </w:pPr>
+            <w:r>
+              <w:rPr>
+                <w:rFonts w:ascii="Consolas" w:cs="Consolas" w:eastAsia="Consolas" w:hAnsi="Consolas"/>
+                <w:sz w:val="20"/>
+                <w:szCs w:val="20"/>
+              </w:rPr>
+              <w:t xml:space="preserve">Then classify targeting as observed state or predicted propensity; if propensity, show the base-rate x lift precision arithmetic. Finally run the customer gate: deflated offer value vs compliance cost.</w:t>
             </w:r>
           </w:p>
         </w:tc>
@@ -1355,6 +1401,18 @@
                 <w:szCs w:val="20"/>
               </w:rPr>
               <w:t xml:space="preserve">☐  B has an anchor and a justification sentence (I10).</w:t>
+            </w:r>
+          </w:p>
+          <w:p>
+            <w:pPr>
+              <w:spacing w:after="40"/>
+            </w:pPr>
+            <w:r>
+              <w:rPr>
+                <w:sz w:val="20"/>
+                <w:szCs w:val="20"/>
+              </w:rPr>
+              <w:t xml:space="preserve">☐  Events came from a CEP map, not from instinct; unobservable ones were routed out of this budget (I13).</w:t>
             </w:r>
           </w:p>
           <w:p>
@@ -1872,6 +1930,1024 @@
     </w:tbl>
     <w:p>
       <w:pPr>
+        <w:spacing w:after="80"/>
+      </w:pPr>
+    </w:p>
+    <w:p>
+      <w:pPr>
+        <w:spacing w:after="120"/>
+      </w:pPr>
+      <w:r>
+        <w:rPr>
+          <w:b/>
+          <w:bCs/>
+          <w:sz w:val="20"/>
+          <w:szCs w:val="20"/>
+        </w:rPr>
+        <w:t xml:space="preserve">Category entry point map — the derived event list (Step 2, item 3):</w:t>
+      </w:r>
+    </w:p>
+    <w:tbl>
+      <w:tblPr>
+        <w:tblW w:type="dxa" w:w="9026"/>
+        <w:tblBorders>
+          <w:top w:val="single" w:color="auto" w:sz="4"/>
+          <w:left w:val="single" w:color="auto" w:sz="4"/>
+          <w:bottom w:val="single" w:color="auto" w:sz="4"/>
+          <w:right w:val="single" w:color="auto" w:sz="4"/>
+          <w:insideH w:val="single" w:color="auto" w:sz="4"/>
+          <w:insideV w:val="single" w:color="auto" w:sz="4"/>
+        </w:tblBorders>
+      </w:tblPr>
+      <w:tblGrid>
+        <w:gridCol w:w="2400"/>
+        <w:gridCol w:w="2300"/>
+        <w:gridCol w:w="2300"/>
+        <w:gridCol w:w="2026"/>
+      </w:tblGrid>
+      <w:tr>
+        <w:tc>
+          <w:tcPr>
+            <w:tcW w:type="dxa" w:w="2400"/>
+            <w:tcBorders>
+              <w:top w:val="single" w:color="B0B8C4" w:sz="4"/>
+              <w:left w:val="single" w:color="B0B8C4" w:sz="4"/>
+              <w:bottom w:val="single" w:color="B0B8C4" w:sz="4"/>
+              <w:right w:val="single" w:color="B0B8C4" w:sz="4"/>
+            </w:tcBorders>
+            <w:shd w:fill="DDE1E7" w:val="clear"/>
+            <w:tcMar>
+              <w:top w:type="dxa" w:w="60"/>
+              <w:left w:type="dxa" w:w="100"/>
+              <w:bottom w:type="dxa" w:w="60"/>
+              <w:right w:type="dxa" w:w="100"/>
+            </w:tcMar>
+          </w:tcPr>
+          <w:p>
+            <w:r>
+              <w:rPr>
+                <w:b/>
+                <w:bCs/>
+                <w:i w:val="false"/>
+                <w:iCs w:val="false"/>
+                <w:sz w:val="20"/>
+                <w:szCs w:val="20"/>
+              </w:rPr>
+              <w:t xml:space="preserve">Occasion (buyer-side)</w:t>
+            </w:r>
+          </w:p>
+        </w:tc>
+        <w:tc>
+          <w:tcPr>
+            <w:tcW w:type="dxa" w:w="2300"/>
+            <w:tcBorders>
+              <w:top w:val="single" w:color="B0B8C4" w:sz="4"/>
+              <w:left w:val="single" w:color="B0B8C4" w:sz="4"/>
+              <w:bottom w:val="single" w:color="B0B8C4" w:sz="4"/>
+              <w:right w:val="single" w:color="B0B8C4" w:sz="4"/>
+            </w:tcBorders>
+            <w:shd w:fill="DDE1E7" w:val="clear"/>
+            <w:tcMar>
+              <w:top w:type="dxa" w:w="60"/>
+              <w:left w:type="dxa" w:w="100"/>
+              <w:bottom w:type="dxa" w:w="60"/>
+              <w:right w:type="dxa" w:w="100"/>
+            </w:tcMar>
+          </w:tcPr>
+          <w:p>
+            <w:r>
+              <w:rPr>
+                <w:b/>
+                <w:bCs/>
+                <w:i w:val="false"/>
+                <w:iCs w:val="false"/>
+                <w:sz w:val="20"/>
+                <w:szCs w:val="20"/>
+              </w:rPr>
+              <w:t xml:space="preserve">How much of the decision it re-opens</w:t>
+            </w:r>
+          </w:p>
+        </w:tc>
+        <w:tc>
+          <w:tcPr>
+            <w:tcW w:type="dxa" w:w="2300"/>
+            <w:tcBorders>
+              <w:top w:val="single" w:color="B0B8C4" w:sz="4"/>
+              <w:left w:val="single" w:color="B0B8C4" w:sz="4"/>
+              <w:bottom w:val="single" w:color="B0B8C4" w:sz="4"/>
+              <w:right w:val="single" w:color="B0B8C4" w:sz="4"/>
+            </w:tcBorders>
+            <w:shd w:fill="DDE1E7" w:val="clear"/>
+            <w:tcMar>
+              <w:top w:type="dxa" w:w="60"/>
+              <w:left w:type="dxa" w:w="100"/>
+              <w:bottom w:type="dxa" w:w="60"/>
+              <w:right w:type="dxa" w:w="100"/>
+            </w:tcMar>
+          </w:tcPr>
+          <w:p>
+            <w:r>
+              <w:rPr>
+                <w:b/>
+                <w:bCs/>
+                <w:i w:val="false"/>
+                <w:iCs w:val="false"/>
+                <w:sz w:val="20"/>
+                <w:szCs w:val="20"/>
+              </w:rPr>
+              <w:t xml:space="preserve">Observable? (our data / partner / registry / no)</w:t>
+            </w:r>
+          </w:p>
+        </w:tc>
+        <w:tc>
+          <w:tcPr>
+            <w:tcW w:type="dxa" w:w="2026"/>
+            <w:tcBorders>
+              <w:top w:val="single" w:color="B0B8C4" w:sz="4"/>
+              <w:left w:val="single" w:color="B0B8C4" w:sz="4"/>
+              <w:bottom w:val="single" w:color="B0B8C4" w:sz="4"/>
+              <w:right w:val="single" w:color="B0B8C4" w:sz="4"/>
+            </w:tcBorders>
+            <w:shd w:fill="DDE1E7" w:val="clear"/>
+            <w:tcMar>
+              <w:top w:type="dxa" w:w="60"/>
+              <w:left w:type="dxa" w:w="100"/>
+              <w:bottom w:type="dxa" w:w="60"/>
+              <w:right w:type="dxa" w:w="100"/>
+            </w:tcMar>
+          </w:tcPr>
+          <w:p>
+            <w:r>
+              <w:rPr>
+                <w:b/>
+                <w:bCs/>
+                <w:i w:val="false"/>
+                <w:iCs w:val="false"/>
+                <w:sz w:val="20"/>
+                <w:szCs w:val="20"/>
+              </w:rPr>
+              <w:t xml:space="preserve">Route: trigger list · brand brief · drop</w:t>
+            </w:r>
+          </w:p>
+        </w:tc>
+      </w:tr>
+      <w:tr>
+        <w:tc>
+          <w:tcPr>
+            <w:tcW w:type="dxa" w:w="2400"/>
+            <w:tcBorders>
+              <w:top w:val="single" w:color="B0B8C4" w:sz="4"/>
+              <w:left w:val="single" w:color="B0B8C4" w:sz="4"/>
+              <w:bottom w:val="single" w:color="B0B8C4" w:sz="4"/>
+              <w:right w:val="single" w:color="B0B8C4" w:sz="4"/>
+            </w:tcBorders>
+            <w:tcMar>
+              <w:top w:type="dxa" w:w="60"/>
+              <w:left w:type="dxa" w:w="100"/>
+              <w:bottom w:type="dxa" w:w="60"/>
+              <w:right w:type="dxa" w:w="100"/>
+            </w:tcMar>
+          </w:tcPr>
+          <w:p>
+            <w:r>
+              <w:rPr>
+                <w:b w:val="false"/>
+                <w:bCs w:val="false"/>
+                <w:i/>
+                <w:iCs/>
+                <w:sz w:val="20"/>
+                <w:szCs w:val="20"/>
+              </w:rPr>
+              <w:t xml:space="preserve">e.g. the business takes on its first employee</w:t>
+            </w:r>
+          </w:p>
+        </w:tc>
+        <w:tc>
+          <w:tcPr>
+            <w:tcW w:type="dxa" w:w="2300"/>
+            <w:tcBorders>
+              <w:top w:val="single" w:color="B0B8C4" w:sz="4"/>
+              <w:left w:val="single" w:color="B0B8C4" w:sz="4"/>
+              <w:bottom w:val="single" w:color="B0B8C4" w:sz="4"/>
+              <w:right w:val="single" w:color="B0B8C4" w:sz="4"/>
+            </w:tcBorders>
+            <w:tcMar>
+              <w:top w:type="dxa" w:w="60"/>
+              <w:left w:type="dxa" w:w="100"/>
+              <w:bottom w:type="dxa" w:w="60"/>
+              <w:right w:type="dxa" w:w="100"/>
+            </w:tcMar>
+          </w:tcPr>
+          <w:p>
+            <w:r>
+              <w:rPr>
+                <w:b w:val="false"/>
+                <w:bCs w:val="false"/>
+                <w:i/>
+                <w:iCs/>
+                <w:sz w:val="20"/>
+                <w:szCs w:val="20"/>
+              </w:rPr>
+              <w:t xml:space="preserve">opens payroll, card and lending together</w:t>
+            </w:r>
+          </w:p>
+        </w:tc>
+        <w:tc>
+          <w:tcPr>
+            <w:tcW w:type="dxa" w:w="2300"/>
+            <w:tcBorders>
+              <w:top w:val="single" w:color="B0B8C4" w:sz="4"/>
+              <w:left w:val="single" w:color="B0B8C4" w:sz="4"/>
+              <w:bottom w:val="single" w:color="B0B8C4" w:sz="4"/>
+              <w:right w:val="single" w:color="B0B8C4" w:sz="4"/>
+            </w:tcBorders>
+            <w:tcMar>
+              <w:top w:type="dxa" w:w="60"/>
+              <w:left w:type="dxa" w:w="100"/>
+              <w:bottom w:type="dxa" w:w="60"/>
+              <w:right w:type="dxa" w:w="100"/>
+            </w:tcMar>
+          </w:tcPr>
+          <w:p>
+            <w:r>
+              <w:rPr>
+                <w:b w:val="false"/>
+                <w:bCs w:val="false"/>
+                <w:i/>
+                <w:iCs/>
+                <w:sz w:val="20"/>
+                <w:szCs w:val="20"/>
+              </w:rPr>
+              <w:t xml:space="preserve">our data — payroll flag appears</w:t>
+            </w:r>
+          </w:p>
+        </w:tc>
+        <w:tc>
+          <w:tcPr>
+            <w:tcW w:type="dxa" w:w="2026"/>
+            <w:tcBorders>
+              <w:top w:val="single" w:color="B0B8C4" w:sz="4"/>
+              <w:left w:val="single" w:color="B0B8C4" w:sz="4"/>
+              <w:bottom w:val="single" w:color="B0B8C4" w:sz="4"/>
+              <w:right w:val="single" w:color="B0B8C4" w:sz="4"/>
+            </w:tcBorders>
+            <w:tcMar>
+              <w:top w:type="dxa" w:w="60"/>
+              <w:left w:type="dxa" w:w="100"/>
+              <w:bottom w:type="dxa" w:w="60"/>
+              <w:right w:type="dxa" w:w="100"/>
+            </w:tcMar>
+          </w:tcPr>
+          <w:p>
+            <w:r>
+              <w:rPr>
+                <w:b w:val="false"/>
+                <w:bCs w:val="false"/>
+                <w:i/>
+                <w:iCs/>
+                <w:sz w:val="20"/>
+                <w:szCs w:val="20"/>
+              </w:rPr>
+              <w:t xml:space="preserve">trigger list</w:t>
+            </w:r>
+          </w:p>
+        </w:tc>
+      </w:tr>
+      <w:tr>
+        <w:tc>
+          <w:tcPr>
+            <w:tcW w:type="dxa" w:w="2400"/>
+            <w:tcBorders>
+              <w:top w:val="single" w:color="B0B8C4" w:sz="4"/>
+              <w:left w:val="single" w:color="B0B8C4" w:sz="4"/>
+              <w:bottom w:val="single" w:color="B0B8C4" w:sz="4"/>
+              <w:right w:val="single" w:color="B0B8C4" w:sz="4"/>
+            </w:tcBorders>
+            <w:tcMar>
+              <w:top w:type="dxa" w:w="60"/>
+              <w:left w:type="dxa" w:w="100"/>
+              <w:bottom w:type="dxa" w:w="60"/>
+              <w:right w:type="dxa" w:w="100"/>
+            </w:tcMar>
+          </w:tcPr>
+          <w:p>
+            <w:r>
+              <w:rPr>
+                <w:b w:val="false"/>
+                <w:bCs w:val="false"/>
+                <w:i w:val="false"/>
+                <w:iCs w:val="false"/>
+                <w:sz w:val="20"/>
+                <w:szCs w:val="20"/>
+              </w:rPr>
+              <w:t xml:space="preserve"/>
+            </w:r>
+          </w:p>
+        </w:tc>
+        <w:tc>
+          <w:tcPr>
+            <w:tcW w:type="dxa" w:w="2300"/>
+            <w:tcBorders>
+              <w:top w:val="single" w:color="B0B8C4" w:sz="4"/>
+              <w:left w:val="single" w:color="B0B8C4" w:sz="4"/>
+              <w:bottom w:val="single" w:color="B0B8C4" w:sz="4"/>
+              <w:right w:val="single" w:color="B0B8C4" w:sz="4"/>
+            </w:tcBorders>
+            <w:tcMar>
+              <w:top w:type="dxa" w:w="60"/>
+              <w:left w:type="dxa" w:w="100"/>
+              <w:bottom w:type="dxa" w:w="60"/>
+              <w:right w:type="dxa" w:w="100"/>
+            </w:tcMar>
+          </w:tcPr>
+          <w:p>
+            <w:r>
+              <w:rPr>
+                <w:b w:val="false"/>
+                <w:bCs w:val="false"/>
+                <w:i w:val="false"/>
+                <w:iCs w:val="false"/>
+                <w:sz w:val="20"/>
+                <w:szCs w:val="20"/>
+              </w:rPr>
+              <w:t xml:space="preserve"/>
+            </w:r>
+          </w:p>
+        </w:tc>
+        <w:tc>
+          <w:tcPr>
+            <w:tcW w:type="dxa" w:w="2300"/>
+            <w:tcBorders>
+              <w:top w:val="single" w:color="B0B8C4" w:sz="4"/>
+              <w:left w:val="single" w:color="B0B8C4" w:sz="4"/>
+              <w:bottom w:val="single" w:color="B0B8C4" w:sz="4"/>
+              <w:right w:val="single" w:color="B0B8C4" w:sz="4"/>
+            </w:tcBorders>
+            <w:tcMar>
+              <w:top w:type="dxa" w:w="60"/>
+              <w:left w:type="dxa" w:w="100"/>
+              <w:bottom w:type="dxa" w:w="60"/>
+              <w:right w:type="dxa" w:w="100"/>
+            </w:tcMar>
+          </w:tcPr>
+          <w:p>
+            <w:r>
+              <w:rPr>
+                <w:b w:val="false"/>
+                <w:bCs w:val="false"/>
+                <w:i w:val="false"/>
+                <w:iCs w:val="false"/>
+                <w:sz w:val="20"/>
+                <w:szCs w:val="20"/>
+              </w:rPr>
+              <w:t xml:space="preserve"/>
+            </w:r>
+          </w:p>
+        </w:tc>
+        <w:tc>
+          <w:tcPr>
+            <w:tcW w:type="dxa" w:w="2026"/>
+            <w:tcBorders>
+              <w:top w:val="single" w:color="B0B8C4" w:sz="4"/>
+              <w:left w:val="single" w:color="B0B8C4" w:sz="4"/>
+              <w:bottom w:val="single" w:color="B0B8C4" w:sz="4"/>
+              <w:right w:val="single" w:color="B0B8C4" w:sz="4"/>
+            </w:tcBorders>
+            <w:tcMar>
+              <w:top w:type="dxa" w:w="60"/>
+              <w:left w:type="dxa" w:w="100"/>
+              <w:bottom w:type="dxa" w:w="60"/>
+              <w:right w:type="dxa" w:w="100"/>
+            </w:tcMar>
+          </w:tcPr>
+          <w:p>
+            <w:r>
+              <w:rPr>
+                <w:b w:val="false"/>
+                <w:bCs w:val="false"/>
+                <w:i w:val="false"/>
+                <w:iCs w:val="false"/>
+                <w:sz w:val="20"/>
+                <w:szCs w:val="20"/>
+              </w:rPr>
+              <w:t xml:space="preserve"/>
+            </w:r>
+          </w:p>
+        </w:tc>
+      </w:tr>
+      <w:tr>
+        <w:tc>
+          <w:tcPr>
+            <w:tcW w:type="dxa" w:w="2400"/>
+            <w:tcBorders>
+              <w:top w:val="single" w:color="B0B8C4" w:sz="4"/>
+              <w:left w:val="single" w:color="B0B8C4" w:sz="4"/>
+              <w:bottom w:val="single" w:color="B0B8C4" w:sz="4"/>
+              <w:right w:val="single" w:color="B0B8C4" w:sz="4"/>
+            </w:tcBorders>
+            <w:tcMar>
+              <w:top w:type="dxa" w:w="60"/>
+              <w:left w:type="dxa" w:w="100"/>
+              <w:bottom w:type="dxa" w:w="60"/>
+              <w:right w:type="dxa" w:w="100"/>
+            </w:tcMar>
+          </w:tcPr>
+          <w:p>
+            <w:r>
+              <w:rPr>
+                <w:b w:val="false"/>
+                <w:bCs w:val="false"/>
+                <w:i w:val="false"/>
+                <w:iCs w:val="false"/>
+                <w:sz w:val="20"/>
+                <w:szCs w:val="20"/>
+              </w:rPr>
+              <w:t xml:space="preserve"/>
+            </w:r>
+          </w:p>
+        </w:tc>
+        <w:tc>
+          <w:tcPr>
+            <w:tcW w:type="dxa" w:w="2300"/>
+            <w:tcBorders>
+              <w:top w:val="single" w:color="B0B8C4" w:sz="4"/>
+              <w:left w:val="single" w:color="B0B8C4" w:sz="4"/>
+              <w:bottom w:val="single" w:color="B0B8C4" w:sz="4"/>
+              <w:right w:val="single" w:color="B0B8C4" w:sz="4"/>
+            </w:tcBorders>
+            <w:tcMar>
+              <w:top w:type="dxa" w:w="60"/>
+              <w:left w:type="dxa" w:w="100"/>
+              <w:bottom w:type="dxa" w:w="60"/>
+              <w:right w:type="dxa" w:w="100"/>
+            </w:tcMar>
+          </w:tcPr>
+          <w:p>
+            <w:r>
+              <w:rPr>
+                <w:b w:val="false"/>
+                <w:bCs w:val="false"/>
+                <w:i w:val="false"/>
+                <w:iCs w:val="false"/>
+                <w:sz w:val="20"/>
+                <w:szCs w:val="20"/>
+              </w:rPr>
+              <w:t xml:space="preserve"/>
+            </w:r>
+          </w:p>
+        </w:tc>
+        <w:tc>
+          <w:tcPr>
+            <w:tcW w:type="dxa" w:w="2300"/>
+            <w:tcBorders>
+              <w:top w:val="single" w:color="B0B8C4" w:sz="4"/>
+              <w:left w:val="single" w:color="B0B8C4" w:sz="4"/>
+              <w:bottom w:val="single" w:color="B0B8C4" w:sz="4"/>
+              <w:right w:val="single" w:color="B0B8C4" w:sz="4"/>
+            </w:tcBorders>
+            <w:tcMar>
+              <w:top w:type="dxa" w:w="60"/>
+              <w:left w:type="dxa" w:w="100"/>
+              <w:bottom w:type="dxa" w:w="60"/>
+              <w:right w:type="dxa" w:w="100"/>
+            </w:tcMar>
+          </w:tcPr>
+          <w:p>
+            <w:r>
+              <w:rPr>
+                <w:b w:val="false"/>
+                <w:bCs w:val="false"/>
+                <w:i w:val="false"/>
+                <w:iCs w:val="false"/>
+                <w:sz w:val="20"/>
+                <w:szCs w:val="20"/>
+              </w:rPr>
+              <w:t xml:space="preserve"/>
+            </w:r>
+          </w:p>
+        </w:tc>
+        <w:tc>
+          <w:tcPr>
+            <w:tcW w:type="dxa" w:w="2026"/>
+            <w:tcBorders>
+              <w:top w:val="single" w:color="B0B8C4" w:sz="4"/>
+              <w:left w:val="single" w:color="B0B8C4" w:sz="4"/>
+              <w:bottom w:val="single" w:color="B0B8C4" w:sz="4"/>
+              <w:right w:val="single" w:color="B0B8C4" w:sz="4"/>
+            </w:tcBorders>
+            <w:tcMar>
+              <w:top w:type="dxa" w:w="60"/>
+              <w:left w:type="dxa" w:w="100"/>
+              <w:bottom w:type="dxa" w:w="60"/>
+              <w:right w:type="dxa" w:w="100"/>
+            </w:tcMar>
+          </w:tcPr>
+          <w:p>
+            <w:r>
+              <w:rPr>
+                <w:b w:val="false"/>
+                <w:bCs w:val="false"/>
+                <w:i w:val="false"/>
+                <w:iCs w:val="false"/>
+                <w:sz w:val="20"/>
+                <w:szCs w:val="20"/>
+              </w:rPr>
+              <w:t xml:space="preserve"/>
+            </w:r>
+          </w:p>
+        </w:tc>
+      </w:tr>
+      <w:tr>
+        <w:tc>
+          <w:tcPr>
+            <w:tcW w:type="dxa" w:w="2400"/>
+            <w:tcBorders>
+              <w:top w:val="single" w:color="B0B8C4" w:sz="4"/>
+              <w:left w:val="single" w:color="B0B8C4" w:sz="4"/>
+              <w:bottom w:val="single" w:color="B0B8C4" w:sz="4"/>
+              <w:right w:val="single" w:color="B0B8C4" w:sz="4"/>
+            </w:tcBorders>
+            <w:tcMar>
+              <w:top w:type="dxa" w:w="60"/>
+              <w:left w:type="dxa" w:w="100"/>
+              <w:bottom w:type="dxa" w:w="60"/>
+              <w:right w:type="dxa" w:w="100"/>
+            </w:tcMar>
+          </w:tcPr>
+          <w:p>
+            <w:r>
+              <w:rPr>
+                <w:b w:val="false"/>
+                <w:bCs w:val="false"/>
+                <w:i w:val="false"/>
+                <w:iCs w:val="false"/>
+                <w:sz w:val="20"/>
+                <w:szCs w:val="20"/>
+              </w:rPr>
+              <w:t xml:space="preserve"/>
+            </w:r>
+          </w:p>
+        </w:tc>
+        <w:tc>
+          <w:tcPr>
+            <w:tcW w:type="dxa" w:w="2300"/>
+            <w:tcBorders>
+              <w:top w:val="single" w:color="B0B8C4" w:sz="4"/>
+              <w:left w:val="single" w:color="B0B8C4" w:sz="4"/>
+              <w:bottom w:val="single" w:color="B0B8C4" w:sz="4"/>
+              <w:right w:val="single" w:color="B0B8C4" w:sz="4"/>
+            </w:tcBorders>
+            <w:tcMar>
+              <w:top w:type="dxa" w:w="60"/>
+              <w:left w:type="dxa" w:w="100"/>
+              <w:bottom w:type="dxa" w:w="60"/>
+              <w:right w:type="dxa" w:w="100"/>
+            </w:tcMar>
+          </w:tcPr>
+          <w:p>
+            <w:r>
+              <w:rPr>
+                <w:b w:val="false"/>
+                <w:bCs w:val="false"/>
+                <w:i w:val="false"/>
+                <w:iCs w:val="false"/>
+                <w:sz w:val="20"/>
+                <w:szCs w:val="20"/>
+              </w:rPr>
+              <w:t xml:space="preserve"/>
+            </w:r>
+          </w:p>
+        </w:tc>
+        <w:tc>
+          <w:tcPr>
+            <w:tcW w:type="dxa" w:w="2300"/>
+            <w:tcBorders>
+              <w:top w:val="single" w:color="B0B8C4" w:sz="4"/>
+              <w:left w:val="single" w:color="B0B8C4" w:sz="4"/>
+              <w:bottom w:val="single" w:color="B0B8C4" w:sz="4"/>
+              <w:right w:val="single" w:color="B0B8C4" w:sz="4"/>
+            </w:tcBorders>
+            <w:tcMar>
+              <w:top w:type="dxa" w:w="60"/>
+              <w:left w:type="dxa" w:w="100"/>
+              <w:bottom w:type="dxa" w:w="60"/>
+              <w:right w:type="dxa" w:w="100"/>
+            </w:tcMar>
+          </w:tcPr>
+          <w:p>
+            <w:r>
+              <w:rPr>
+                <w:b w:val="false"/>
+                <w:bCs w:val="false"/>
+                <w:i w:val="false"/>
+                <w:iCs w:val="false"/>
+                <w:sz w:val="20"/>
+                <w:szCs w:val="20"/>
+              </w:rPr>
+              <w:t xml:space="preserve"/>
+            </w:r>
+          </w:p>
+        </w:tc>
+        <w:tc>
+          <w:tcPr>
+            <w:tcW w:type="dxa" w:w="2026"/>
+            <w:tcBorders>
+              <w:top w:val="single" w:color="B0B8C4" w:sz="4"/>
+              <w:left w:val="single" w:color="B0B8C4" w:sz="4"/>
+              <w:bottom w:val="single" w:color="B0B8C4" w:sz="4"/>
+              <w:right w:val="single" w:color="B0B8C4" w:sz="4"/>
+            </w:tcBorders>
+            <w:tcMar>
+              <w:top w:type="dxa" w:w="60"/>
+              <w:left w:type="dxa" w:w="100"/>
+              <w:bottom w:type="dxa" w:w="60"/>
+              <w:right w:type="dxa" w:w="100"/>
+            </w:tcMar>
+          </w:tcPr>
+          <w:p>
+            <w:r>
+              <w:rPr>
+                <w:b w:val="false"/>
+                <w:bCs w:val="false"/>
+                <w:i w:val="false"/>
+                <w:iCs w:val="false"/>
+                <w:sz w:val="20"/>
+                <w:szCs w:val="20"/>
+              </w:rPr>
+              <w:t xml:space="preserve"/>
+            </w:r>
+          </w:p>
+        </w:tc>
+      </w:tr>
+      <w:tr>
+        <w:tc>
+          <w:tcPr>
+            <w:tcW w:type="dxa" w:w="2400"/>
+            <w:tcBorders>
+              <w:top w:val="single" w:color="B0B8C4" w:sz="4"/>
+              <w:left w:val="single" w:color="B0B8C4" w:sz="4"/>
+              <w:bottom w:val="single" w:color="B0B8C4" w:sz="4"/>
+              <w:right w:val="single" w:color="B0B8C4" w:sz="4"/>
+            </w:tcBorders>
+            <w:tcMar>
+              <w:top w:type="dxa" w:w="60"/>
+              <w:left w:type="dxa" w:w="100"/>
+              <w:bottom w:type="dxa" w:w="60"/>
+              <w:right w:type="dxa" w:w="100"/>
+            </w:tcMar>
+          </w:tcPr>
+          <w:p>
+            <w:r>
+              <w:rPr>
+                <w:b w:val="false"/>
+                <w:bCs w:val="false"/>
+                <w:i w:val="false"/>
+                <w:iCs w:val="false"/>
+                <w:sz w:val="20"/>
+                <w:szCs w:val="20"/>
+              </w:rPr>
+              <w:t xml:space="preserve"/>
+            </w:r>
+          </w:p>
+        </w:tc>
+        <w:tc>
+          <w:tcPr>
+            <w:tcW w:type="dxa" w:w="2300"/>
+            <w:tcBorders>
+              <w:top w:val="single" w:color="B0B8C4" w:sz="4"/>
+              <w:left w:val="single" w:color="B0B8C4" w:sz="4"/>
+              <w:bottom w:val="single" w:color="B0B8C4" w:sz="4"/>
+              <w:right w:val="single" w:color="B0B8C4" w:sz="4"/>
+            </w:tcBorders>
+            <w:tcMar>
+              <w:top w:type="dxa" w:w="60"/>
+              <w:left w:type="dxa" w:w="100"/>
+              <w:bottom w:type="dxa" w:w="60"/>
+              <w:right w:type="dxa" w:w="100"/>
+            </w:tcMar>
+          </w:tcPr>
+          <w:p>
+            <w:r>
+              <w:rPr>
+                <w:b w:val="false"/>
+                <w:bCs w:val="false"/>
+                <w:i w:val="false"/>
+                <w:iCs w:val="false"/>
+                <w:sz w:val="20"/>
+                <w:szCs w:val="20"/>
+              </w:rPr>
+              <w:t xml:space="preserve"/>
+            </w:r>
+          </w:p>
+        </w:tc>
+        <w:tc>
+          <w:tcPr>
+            <w:tcW w:type="dxa" w:w="2300"/>
+            <w:tcBorders>
+              <w:top w:val="single" w:color="B0B8C4" w:sz="4"/>
+              <w:left w:val="single" w:color="B0B8C4" w:sz="4"/>
+              <w:bottom w:val="single" w:color="B0B8C4" w:sz="4"/>
+              <w:right w:val="single" w:color="B0B8C4" w:sz="4"/>
+            </w:tcBorders>
+            <w:tcMar>
+              <w:top w:type="dxa" w:w="60"/>
+              <w:left w:type="dxa" w:w="100"/>
+              <w:bottom w:type="dxa" w:w="60"/>
+              <w:right w:type="dxa" w:w="100"/>
+            </w:tcMar>
+          </w:tcPr>
+          <w:p>
+            <w:r>
+              <w:rPr>
+                <w:b w:val="false"/>
+                <w:bCs w:val="false"/>
+                <w:i w:val="false"/>
+                <w:iCs w:val="false"/>
+                <w:sz w:val="20"/>
+                <w:szCs w:val="20"/>
+              </w:rPr>
+              <w:t xml:space="preserve"/>
+            </w:r>
+          </w:p>
+        </w:tc>
+        <w:tc>
+          <w:tcPr>
+            <w:tcW w:type="dxa" w:w="2026"/>
+            <w:tcBorders>
+              <w:top w:val="single" w:color="B0B8C4" w:sz="4"/>
+              <w:left w:val="single" w:color="B0B8C4" w:sz="4"/>
+              <w:bottom w:val="single" w:color="B0B8C4" w:sz="4"/>
+              <w:right w:val="single" w:color="B0B8C4" w:sz="4"/>
+            </w:tcBorders>
+            <w:tcMar>
+              <w:top w:type="dxa" w:w="60"/>
+              <w:left w:type="dxa" w:w="100"/>
+              <w:bottom w:type="dxa" w:w="60"/>
+              <w:right w:type="dxa" w:w="100"/>
+            </w:tcMar>
+          </w:tcPr>
+          <w:p>
+            <w:r>
+              <w:rPr>
+                <w:b w:val="false"/>
+                <w:bCs w:val="false"/>
+                <w:i w:val="false"/>
+                <w:iCs w:val="false"/>
+                <w:sz w:val="20"/>
+                <w:szCs w:val="20"/>
+              </w:rPr>
+              <w:t xml:space="preserve"/>
+            </w:r>
+          </w:p>
+        </w:tc>
+      </w:tr>
+      <w:tr>
+        <w:tc>
+          <w:tcPr>
+            <w:tcW w:type="dxa" w:w="2400"/>
+            <w:tcBorders>
+              <w:top w:val="single" w:color="B0B8C4" w:sz="4"/>
+              <w:left w:val="single" w:color="B0B8C4" w:sz="4"/>
+              <w:bottom w:val="single" w:color="B0B8C4" w:sz="4"/>
+              <w:right w:val="single" w:color="B0B8C4" w:sz="4"/>
+            </w:tcBorders>
+            <w:tcMar>
+              <w:top w:type="dxa" w:w="60"/>
+              <w:left w:type="dxa" w:w="100"/>
+              <w:bottom w:type="dxa" w:w="60"/>
+              <w:right w:type="dxa" w:w="100"/>
+            </w:tcMar>
+          </w:tcPr>
+          <w:p>
+            <w:r>
+              <w:rPr>
+                <w:b w:val="false"/>
+                <w:bCs w:val="false"/>
+                <w:i w:val="false"/>
+                <w:iCs w:val="false"/>
+                <w:sz w:val="20"/>
+                <w:szCs w:val="20"/>
+              </w:rPr>
+              <w:t xml:space="preserve"/>
+            </w:r>
+          </w:p>
+        </w:tc>
+        <w:tc>
+          <w:tcPr>
+            <w:tcW w:type="dxa" w:w="2300"/>
+            <w:tcBorders>
+              <w:top w:val="single" w:color="B0B8C4" w:sz="4"/>
+              <w:left w:val="single" w:color="B0B8C4" w:sz="4"/>
+              <w:bottom w:val="single" w:color="B0B8C4" w:sz="4"/>
+              <w:right w:val="single" w:color="B0B8C4" w:sz="4"/>
+            </w:tcBorders>
+            <w:tcMar>
+              <w:top w:type="dxa" w:w="60"/>
+              <w:left w:type="dxa" w:w="100"/>
+              <w:bottom w:type="dxa" w:w="60"/>
+              <w:right w:type="dxa" w:w="100"/>
+            </w:tcMar>
+          </w:tcPr>
+          <w:p>
+            <w:r>
+              <w:rPr>
+                <w:b w:val="false"/>
+                <w:bCs w:val="false"/>
+                <w:i w:val="false"/>
+                <w:iCs w:val="false"/>
+                <w:sz w:val="20"/>
+                <w:szCs w:val="20"/>
+              </w:rPr>
+              <w:t xml:space="preserve"/>
+            </w:r>
+          </w:p>
+        </w:tc>
+        <w:tc>
+          <w:tcPr>
+            <w:tcW w:type="dxa" w:w="2300"/>
+            <w:tcBorders>
+              <w:top w:val="single" w:color="B0B8C4" w:sz="4"/>
+              <w:left w:val="single" w:color="B0B8C4" w:sz="4"/>
+              <w:bottom w:val="single" w:color="B0B8C4" w:sz="4"/>
+              <w:right w:val="single" w:color="B0B8C4" w:sz="4"/>
+            </w:tcBorders>
+            <w:tcMar>
+              <w:top w:type="dxa" w:w="60"/>
+              <w:left w:type="dxa" w:w="100"/>
+              <w:bottom w:type="dxa" w:w="60"/>
+              <w:right w:type="dxa" w:w="100"/>
+            </w:tcMar>
+          </w:tcPr>
+          <w:p>
+            <w:r>
+              <w:rPr>
+                <w:b w:val="false"/>
+                <w:bCs w:val="false"/>
+                <w:i w:val="false"/>
+                <w:iCs w:val="false"/>
+                <w:sz w:val="20"/>
+                <w:szCs w:val="20"/>
+              </w:rPr>
+              <w:t xml:space="preserve"/>
+            </w:r>
+          </w:p>
+        </w:tc>
+        <w:tc>
+          <w:tcPr>
+            <w:tcW w:type="dxa" w:w="2026"/>
+            <w:tcBorders>
+              <w:top w:val="single" w:color="B0B8C4" w:sz="4"/>
+              <w:left w:val="single" w:color="B0B8C4" w:sz="4"/>
+              <w:bottom w:val="single" w:color="B0B8C4" w:sz="4"/>
+              <w:right w:val="single" w:color="B0B8C4" w:sz="4"/>
+            </w:tcBorders>
+            <w:tcMar>
+              <w:top w:type="dxa" w:w="60"/>
+              <w:left w:type="dxa" w:w="100"/>
+              <w:bottom w:type="dxa" w:w="60"/>
+              <w:right w:type="dxa" w:w="100"/>
+            </w:tcMar>
+          </w:tcPr>
+          <w:p>
+            <w:r>
+              <w:rPr>
+                <w:b w:val="false"/>
+                <w:bCs w:val="false"/>
+                <w:i w:val="false"/>
+                <w:iCs w:val="false"/>
+                <w:sz w:val="20"/>
+                <w:szCs w:val="20"/>
+              </w:rPr>
+              <w:t xml:space="preserve"/>
+            </w:r>
+          </w:p>
+        </w:tc>
+      </w:tr>
+      <w:tr>
+        <w:tc>
+          <w:tcPr>
+            <w:tcW w:type="dxa" w:w="2400"/>
+            <w:tcBorders>
+              <w:top w:val="single" w:color="B0B8C4" w:sz="4"/>
+              <w:left w:val="single" w:color="B0B8C4" w:sz="4"/>
+              <w:bottom w:val="single" w:color="B0B8C4" w:sz="4"/>
+              <w:right w:val="single" w:color="B0B8C4" w:sz="4"/>
+            </w:tcBorders>
+            <w:tcMar>
+              <w:top w:type="dxa" w:w="60"/>
+              <w:left w:type="dxa" w:w="100"/>
+              <w:bottom w:type="dxa" w:w="60"/>
+              <w:right w:type="dxa" w:w="100"/>
+            </w:tcMar>
+          </w:tcPr>
+          <w:p>
+            <w:r>
+              <w:rPr>
+                <w:b w:val="false"/>
+                <w:bCs w:val="false"/>
+                <w:i w:val="false"/>
+                <w:iCs w:val="false"/>
+                <w:sz w:val="20"/>
+                <w:szCs w:val="20"/>
+              </w:rPr>
+              <w:t xml:space="preserve"/>
+            </w:r>
+          </w:p>
+        </w:tc>
+        <w:tc>
+          <w:tcPr>
+            <w:tcW w:type="dxa" w:w="2300"/>
+            <w:tcBorders>
+              <w:top w:val="single" w:color="B0B8C4" w:sz="4"/>
+              <w:left w:val="single" w:color="B0B8C4" w:sz="4"/>
+              <w:bottom w:val="single" w:color="B0B8C4" w:sz="4"/>
+              <w:right w:val="single" w:color="B0B8C4" w:sz="4"/>
+            </w:tcBorders>
+            <w:tcMar>
+              <w:top w:type="dxa" w:w="60"/>
+              <w:left w:type="dxa" w:w="100"/>
+              <w:bottom w:type="dxa" w:w="60"/>
+              <w:right w:type="dxa" w:w="100"/>
+            </w:tcMar>
+          </w:tcPr>
+          <w:p>
+            <w:r>
+              <w:rPr>
+                <w:b w:val="false"/>
+                <w:bCs w:val="false"/>
+                <w:i w:val="false"/>
+                <w:iCs w:val="false"/>
+                <w:sz w:val="20"/>
+                <w:szCs w:val="20"/>
+              </w:rPr>
+              <w:t xml:space="preserve"/>
+            </w:r>
+          </w:p>
+        </w:tc>
+        <w:tc>
+          <w:tcPr>
+            <w:tcW w:type="dxa" w:w="2300"/>
+            <w:tcBorders>
+              <w:top w:val="single" w:color="B0B8C4" w:sz="4"/>
+              <w:left w:val="single" w:color="B0B8C4" w:sz="4"/>
+              <w:bottom w:val="single" w:color="B0B8C4" w:sz="4"/>
+              <w:right w:val="single" w:color="B0B8C4" w:sz="4"/>
+            </w:tcBorders>
+            <w:tcMar>
+              <w:top w:type="dxa" w:w="60"/>
+              <w:left w:type="dxa" w:w="100"/>
+              <w:bottom w:type="dxa" w:w="60"/>
+              <w:right w:type="dxa" w:w="100"/>
+            </w:tcMar>
+          </w:tcPr>
+          <w:p>
+            <w:r>
+              <w:rPr>
+                <w:b w:val="false"/>
+                <w:bCs w:val="false"/>
+                <w:i w:val="false"/>
+                <w:iCs w:val="false"/>
+                <w:sz w:val="20"/>
+                <w:szCs w:val="20"/>
+              </w:rPr>
+              <w:t xml:space="preserve"/>
+            </w:r>
+          </w:p>
+        </w:tc>
+        <w:tc>
+          <w:tcPr>
+            <w:tcW w:type="dxa" w:w="2026"/>
+            <w:tcBorders>
+              <w:top w:val="single" w:color="B0B8C4" w:sz="4"/>
+              <w:left w:val="single" w:color="B0B8C4" w:sz="4"/>
+              <w:bottom w:val="single" w:color="B0B8C4" w:sz="4"/>
+              <w:right w:val="single" w:color="B0B8C4" w:sz="4"/>
+            </w:tcBorders>
+            <w:tcMar>
+              <w:top w:type="dxa" w:w="60"/>
+              <w:left w:type="dxa" w:w="100"/>
+              <w:bottom w:type="dxa" w:w="60"/>
+              <w:right w:type="dxa" w:w="100"/>
+            </w:tcMar>
+          </w:tcPr>
+          <w:p>
+            <w:r>
+              <w:rPr>
+                <w:b w:val="false"/>
+                <w:bCs w:val="false"/>
+                <w:i w:val="false"/>
+                <w:iCs w:val="false"/>
+                <w:sz w:val="20"/>
+                <w:szCs w:val="20"/>
+              </w:rPr>
+              <w:t xml:space="preserve"/>
+            </w:r>
+          </w:p>
+        </w:tc>
+      </w:tr>
+    </w:tbl>
+    <w:p>
+      <w:pPr>
         <w:pStyle w:val="Heading2"/>
         <w:spacing w:after="140" w:before="280"/>
       </w:pPr>
@@ -4437,6 +5513,26 @@
         <w:t xml:space="preserve">fast behaviours read in weeks; slow variables (retention, attrition) need 12+ months and get measurement budget, not programme budget, until they report (I9).</w:t>
       </w:r>
     </w:p>
+    <w:p>
+      <w:pPr>
+        <w:pStyle w:val="ListParagraph"/>
+        <w:numPr>
+          <w:ilvl w:val="0"/>
+          <w:numId w:val="7"/>
+        </w:numPr>
+        <w:spacing w:after="80"/>
+      </w:pPr>
+      <w:r>
+        <w:rPr>
+          <w:b/>
+          <w:bCs/>
+        </w:rPr>
+        <w:t xml:space="preserve">Add a retrieval diagnostic where the mechanic needs to be considered </w:t>
+      </w:r>
+      <w:r>
+        <w:t xml:space="preserve">at an entry point: measure CEP-prompted recall in the same cells, before and at readout. Weak conversion and weak retrieval look the same in the outcome metric and need opposite fixes. Prompted recall is memory measurement, not stated preference — it is admissible.</w:t>
+      </w:r>
+    </w:p>
     <w:tbl>
       <w:tblPr>
         <w:tblW w:type="dxa" w:w="9026"/>
@@ -4678,6 +5774,18 @@
                 <w:szCs w:val="20"/>
               </w:rPr>
               <w:t xml:space="preserve">☐  Sample size shows the arithmetic; duration matches the variable (I9).</w:t>
+            </w:r>
+          </w:p>
+          <w:p>
+            <w:pPr>
+              <w:spacing w:after="40"/>
+            </w:pPr>
+            <w:r>
+              <w:rPr>
+                <w:sz w:val="20"/>
+                <w:szCs w:val="20"/>
+              </w:rPr>
+              <w:t xml:space="preserve">☐  Where the mechanic needs to be considered at an entry point, a retrieval diagnostic runs alongside the behavioural test.</w:t>
             </w:r>
           </w:p>
         </w:tc>
@@ -6697,7 +7805,7 @@
         <w:spacing w:after="80"/>
       </w:pPr>
       <w:r>
-        <w:t xml:space="preserve">Run the final lint in a NEW chat: attach the standard and the filled workbook; "Run lint rules I1-I12. Report each failure by rule number. Report only."</w:t>
+        <w:t xml:space="preserve">Run the final lint in a NEW chat: attach the standard and the filled workbook; "Run lint rules I1-I13. Report each failure by rule number. Report only."</w:t>
       </w:r>
     </w:p>
     <w:tbl>
@@ -6861,7 +7969,7 @@
                 <w:sz w:val="20"/>
                 <w:szCs w:val="20"/>
               </w:rPr>
-              <w:t xml:space="preserve">☐  The fresh-chat lint has run (I1-I12).</w:t>
+              <w:t xml:space="preserve">☐  The fresh-chat lint has run (I1-I13).</w:t>
             </w:r>
           </w:p>
         </w:tc>

</xml_diff>

<commit_message>
feat: Incentive Testing v1.2 — event windows and the lead-time reframing
Adds the two clocks that decide whether an event-triggered offer can
land at all: the customer's event-to-decision latency and the sponsor's
detection-to-offer latency. If the sponsor's clock is slower the
mechanic fails whatever its scores say — a late offer is an absent one.

Reframes observation advantages: under consent-based data sharing they
are not exclusivities but lead times, eroded by three things — mandated
or frictionless sharing, intermediaries the customer tells directly, and
the sponsor's own latency. Prior art now cites Barney's inimitability
test, which is what the reframing applies. Window instrumentation added
to test design; lint rule I14. Workbook synced (Step 2 window check and
map column, Step 5 latency instrumentation, lint I1-I14).

Co-Authored-By: Claude Fable 5 <noreply@anthropic.com>
</commit_message>
<xml_diff>
--- a/Incentive_Test_Workbook.docx
+++ b/Incentive_Test_Workbook.docx
@@ -29,7 +29,7 @@
           <w:sz w:val="19"/>
           <w:szCs w:val="19"/>
         </w:rPr>
-        <w:t xml:space="preserve">v1.1 — category entry point mapping added to Step 2 (derive the events, do not list them) and a retrieval diagnostic to Step 5; lint set now I1-I13. In Simplified Technical English. One incentive mechanic (or one comparable set), one pass through this workbook. Output: a scored, costed offer, a pre-registered experiment, and calibrated parameters that transfer to every future incentive decision.</w:t>
+        <w:t xml:space="preserve">v1.2 — event windows added to Step 2 (two clocks; an observation advantage is a lead time, not data you own) and window instrumentation to Step 5; lint set now I1-I14. v1.1 — category entry point mapping added to Step 2 (derive the events, do not list them) and a retrieval diagnostic to Step 5. In Simplified Technical English. One incentive mechanic (or one comparable set), one pass through this workbook. Output: a scored, costed offer, a pre-registered experiment, and calibrated parameters that transfer to every future incentive decision.</w:t>
       </w:r>
     </w:p>
     <w:p>
@@ -302,7 +302,7 @@
                 <w:sz w:val="20"/>
                 <w:szCs w:val="20"/>
               </w:rPr>
-              <w:t xml:space="preserve">5. End your reply with SELF-CHECK: list the lint rules (I1-I13) this step can break, and give pass or fail for each.</w:t>
+              <w:t xml:space="preserve">5. End your reply with SELF-CHECK: list the lint rules (I1-I14) this step can break, and give pass or fail for each.</w:t>
             </w:r>
           </w:p>
         </w:tc>
@@ -342,7 +342,7 @@
         <w:t xml:space="preserve">1. Self-check — same chat. </w:t>
       </w:r>
       <w:r>
-        <w:t xml:space="preserve">The SELF-CHECK line makes Copilot lint its own output against I1-I13 at the end of every step.</w:t>
+        <w:t xml:space="preserve">The SELF-CHECK line makes Copilot lint its own output against I1-I14 at the end of every step.</w:t>
       </w:r>
     </w:p>
     <w:p>
@@ -357,7 +357,7 @@
         <w:t xml:space="preserve">2. Independent check — new chat. </w:t>
       </w:r>
       <w:r>
-        <w:t xml:space="preserve">For the final test plan, open a new chat, attach the standard and the filled workbook, and write: "Run lint rules I1-I13 on this incentive test plan. Report each failure by rule number."</w:t>
+        <w:t xml:space="preserve">For the final test plan, open a new chat, attach the standard and the filled workbook, and write: "Run lint rules I1-I14 on this incentive test plan. Report each failure by rule number."</w:t>
       </w:r>
     </w:p>
     <w:p>
@@ -1127,6 +1127,26 @@
           <w:b/>
           <w:bCs/>
         </w:rPr>
+        <w:t xml:space="preserve">Check the window on every event you kept (I14). </w:t>
+      </w:r>
+      <w:r>
+        <w:t xml:space="preserve">Two clocks. Customer clock: how long from the occasion arising to the decision closing. Our clock: how long from the signal being observable to the offer reaching the customer — detection, decisioning, approval, delivery. If our clock is slower, the mechanic fails whatever its scores say; a late offer is an absent offer. Where the advantage is an observation advantage, state it as a lead time, not as data we own, and name its erosion paths: easier or mandated data sharing, intermediaries the customer tells directly, and our own latency.</w:t>
+      </w:r>
+    </w:p>
+    <w:p>
+      <w:pPr>
+        <w:pStyle w:val="ListParagraph"/>
+        <w:numPr>
+          <w:ilvl w:val="0"/>
+          <w:numId w:val="4"/>
+        </w:numPr>
+        <w:spacing w:after="80"/>
+      </w:pPr>
+      <w:r>
+        <w:rPr>
+          <w:b/>
+          <w:bCs/>
+        </w:rPr>
         <w:t xml:space="preserve">Classify the targeting: </w:t>
       </w:r>
       <w:r>
@@ -1413,6 +1433,30 @@
                 <w:szCs w:val="20"/>
               </w:rPr>
               <w:t xml:space="preserve">☐  Events came from a CEP map, not from instinct; unobservable ones were routed out of this budget (I13).</w:t>
+            </w:r>
+          </w:p>
+          <w:p>
+            <w:pPr>
+              <w:spacing w:after="40"/>
+            </w:pPr>
+            <w:r>
+              <w:rPr>
+                <w:sz w:val="20"/>
+                <w:szCs w:val="20"/>
+              </w:rPr>
+              <w:t xml:space="preserve">☐  Every kept event has both clocks stated, and we are inside the window (I14).</w:t>
+            </w:r>
+          </w:p>
+          <w:p>
+            <w:pPr>
+              <w:spacing w:after="40"/>
+            </w:pPr>
+            <w:r>
+              <w:rPr>
+                <w:sz w:val="20"/>
+                <w:szCs w:val="20"/>
+              </w:rPr>
+              <w:t xml:space="preserve">☐  Any observation advantage is stated as a lead time with erosion paths named — not as data we own (I14).</w:t>
             </w:r>
           </w:p>
           <w:p>
@@ -1960,15 +2004,16 @@
         </w:tblBorders>
       </w:tblPr>
       <w:tblGrid>
-        <w:gridCol w:w="2400"/>
-        <w:gridCol w:w="2300"/>
-        <w:gridCol w:w="2300"/>
-        <w:gridCol w:w="2026"/>
+        <w:gridCol w:w="2000"/>
+        <w:gridCol w:w="1800"/>
+        <w:gridCol w:w="1800"/>
+        <w:gridCol w:w="1800"/>
+        <w:gridCol w:w="1626"/>
       </w:tblGrid>
       <w:tr>
         <w:tc>
           <w:tcPr>
-            <w:tcW w:type="dxa" w:w="2400"/>
+            <w:tcW w:type="dxa" w:w="2000"/>
             <w:tcBorders>
               <w:top w:val="single" w:color="B0B8C4" w:sz="4"/>
               <w:left w:val="single" w:color="B0B8C4" w:sz="4"/>
@@ -1999,7 +2044,7 @@
         </w:tc>
         <w:tc>
           <w:tcPr>
-            <w:tcW w:type="dxa" w:w="2300"/>
+            <w:tcW w:type="dxa" w:w="1800"/>
             <w:tcBorders>
               <w:top w:val="single" w:color="B0B8C4" w:sz="4"/>
               <w:left w:val="single" w:color="B0B8C4" w:sz="4"/>
@@ -2030,7 +2075,7 @@
         </w:tc>
         <w:tc>
           <w:tcPr>
-            <w:tcW w:type="dxa" w:w="2300"/>
+            <w:tcW w:type="dxa" w:w="1800"/>
             <w:tcBorders>
               <w:top w:val="single" w:color="B0B8C4" w:sz="4"/>
               <w:left w:val="single" w:color="B0B8C4" w:sz="4"/>
@@ -2061,7 +2106,7 @@
         </w:tc>
         <w:tc>
           <w:tcPr>
-            <w:tcW w:type="dxa" w:w="2026"/>
+            <w:tcW w:type="dxa" w:w="1800"/>
             <w:tcBorders>
               <w:top w:val="single" w:color="B0B8C4" w:sz="4"/>
               <w:left w:val="single" w:color="B0B8C4" w:sz="4"/>
@@ -2086,6 +2131,37 @@
                 <w:sz w:val="20"/>
                 <w:szCs w:val="20"/>
               </w:rPr>
+              <w:t xml:space="preserve">Window: their clock vs our clock</w:t>
+            </w:r>
+          </w:p>
+        </w:tc>
+        <w:tc>
+          <w:tcPr>
+            <w:tcW w:type="dxa" w:w="1626"/>
+            <w:tcBorders>
+              <w:top w:val="single" w:color="B0B8C4" w:sz="4"/>
+              <w:left w:val="single" w:color="B0B8C4" w:sz="4"/>
+              <w:bottom w:val="single" w:color="B0B8C4" w:sz="4"/>
+              <w:right w:val="single" w:color="B0B8C4" w:sz="4"/>
+            </w:tcBorders>
+            <w:shd w:fill="DDE1E7" w:val="clear"/>
+            <w:tcMar>
+              <w:top w:type="dxa" w:w="60"/>
+              <w:left w:type="dxa" w:w="100"/>
+              <w:bottom w:type="dxa" w:w="60"/>
+              <w:right w:type="dxa" w:w="100"/>
+            </w:tcMar>
+          </w:tcPr>
+          <w:p>
+            <w:r>
+              <w:rPr>
+                <w:b/>
+                <w:bCs/>
+                <w:i w:val="false"/>
+                <w:iCs w:val="false"/>
+                <w:sz w:val="20"/>
+                <w:szCs w:val="20"/>
+              </w:rPr>
               <w:t xml:space="preserve">Route: trigger list · brand brief · drop</w:t>
             </w:r>
           </w:p>
@@ -2094,7 +2170,7 @@
       <w:tr>
         <w:tc>
           <w:tcPr>
-            <w:tcW w:type="dxa" w:w="2400"/>
+            <w:tcW w:type="dxa" w:w="2000"/>
             <w:tcBorders>
               <w:top w:val="single" w:color="B0B8C4" w:sz="4"/>
               <w:left w:val="single" w:color="B0B8C4" w:sz="4"/>
@@ -2124,7 +2200,7 @@
         </w:tc>
         <w:tc>
           <w:tcPr>
-            <w:tcW w:type="dxa" w:w="2300"/>
+            <w:tcW w:type="dxa" w:w="1800"/>
             <w:tcBorders>
               <w:top w:val="single" w:color="B0B8C4" w:sz="4"/>
               <w:left w:val="single" w:color="B0B8C4" w:sz="4"/>
@@ -2154,7 +2230,7 @@
         </w:tc>
         <w:tc>
           <w:tcPr>
-            <w:tcW w:type="dxa" w:w="2300"/>
+            <w:tcW w:type="dxa" w:w="1800"/>
             <w:tcBorders>
               <w:top w:val="single" w:color="B0B8C4" w:sz="4"/>
               <w:left w:val="single" w:color="B0B8C4" w:sz="4"/>
@@ -2184,7 +2260,7 @@
         </w:tc>
         <w:tc>
           <w:tcPr>
-            <w:tcW w:type="dxa" w:w="2026"/>
+            <w:tcW w:type="dxa" w:w="1800"/>
             <w:tcBorders>
               <w:top w:val="single" w:color="B0B8C4" w:sz="4"/>
               <w:left w:val="single" w:color="B0B8C4" w:sz="4"/>
@@ -2208,6 +2284,36 @@
                 <w:sz w:val="20"/>
                 <w:szCs w:val="20"/>
               </w:rPr>
+              <w:t xml:space="preserve">decides in ~3 weeks; we can offer in ~1</w:t>
+            </w:r>
+          </w:p>
+        </w:tc>
+        <w:tc>
+          <w:tcPr>
+            <w:tcW w:type="dxa" w:w="1626"/>
+            <w:tcBorders>
+              <w:top w:val="single" w:color="B0B8C4" w:sz="4"/>
+              <w:left w:val="single" w:color="B0B8C4" w:sz="4"/>
+              <w:bottom w:val="single" w:color="B0B8C4" w:sz="4"/>
+              <w:right w:val="single" w:color="B0B8C4" w:sz="4"/>
+            </w:tcBorders>
+            <w:tcMar>
+              <w:top w:type="dxa" w:w="60"/>
+              <w:left w:type="dxa" w:w="100"/>
+              <w:bottom w:type="dxa" w:w="60"/>
+              <w:right w:type="dxa" w:w="100"/>
+            </w:tcMar>
+          </w:tcPr>
+          <w:p>
+            <w:r>
+              <w:rPr>
+                <w:b w:val="false"/>
+                <w:bCs w:val="false"/>
+                <w:i/>
+                <w:iCs/>
+                <w:sz w:val="20"/>
+                <w:szCs w:val="20"/>
+              </w:rPr>
               <w:t xml:space="preserve">trigger list</w:t>
             </w:r>
           </w:p>
@@ -2216,97 +2322,127 @@
       <w:tr>
         <w:tc>
           <w:tcPr>
-            <w:tcW w:type="dxa" w:w="2400"/>
-            <w:tcBorders>
-              <w:top w:val="single" w:color="B0B8C4" w:sz="4"/>
-              <w:left w:val="single" w:color="B0B8C4" w:sz="4"/>
-              <w:bottom w:val="single" w:color="B0B8C4" w:sz="4"/>
-              <w:right w:val="single" w:color="B0B8C4" w:sz="4"/>
-            </w:tcBorders>
-            <w:tcMar>
-              <w:top w:type="dxa" w:w="60"/>
-              <w:left w:type="dxa" w:w="100"/>
-              <w:bottom w:type="dxa" w:w="60"/>
-              <w:right w:type="dxa" w:w="100"/>
-            </w:tcMar>
-          </w:tcPr>
-          <w:p>
-            <w:r>
-              <w:rPr>
-                <w:b w:val="false"/>
-                <w:bCs w:val="false"/>
-                <w:i w:val="false"/>
-                <w:iCs w:val="false"/>
-                <w:sz w:val="20"/>
-                <w:szCs w:val="20"/>
-              </w:rPr>
-              <w:t xml:space="preserve"/>
-            </w:r>
-          </w:p>
-        </w:tc>
-        <w:tc>
-          <w:tcPr>
-            <w:tcW w:type="dxa" w:w="2300"/>
-            <w:tcBorders>
-              <w:top w:val="single" w:color="B0B8C4" w:sz="4"/>
-              <w:left w:val="single" w:color="B0B8C4" w:sz="4"/>
-              <w:bottom w:val="single" w:color="B0B8C4" w:sz="4"/>
-              <w:right w:val="single" w:color="B0B8C4" w:sz="4"/>
-            </w:tcBorders>
-            <w:tcMar>
-              <w:top w:type="dxa" w:w="60"/>
-              <w:left w:type="dxa" w:w="100"/>
-              <w:bottom w:type="dxa" w:w="60"/>
-              <w:right w:type="dxa" w:w="100"/>
-            </w:tcMar>
-          </w:tcPr>
-          <w:p>
-            <w:r>
-              <w:rPr>
-                <w:b w:val="false"/>
-                <w:bCs w:val="false"/>
-                <w:i w:val="false"/>
-                <w:iCs w:val="false"/>
-                <w:sz w:val="20"/>
-                <w:szCs w:val="20"/>
-              </w:rPr>
-              <w:t xml:space="preserve"/>
-            </w:r>
-          </w:p>
-        </w:tc>
-        <w:tc>
-          <w:tcPr>
-            <w:tcW w:type="dxa" w:w="2300"/>
-            <w:tcBorders>
-              <w:top w:val="single" w:color="B0B8C4" w:sz="4"/>
-              <w:left w:val="single" w:color="B0B8C4" w:sz="4"/>
-              <w:bottom w:val="single" w:color="B0B8C4" w:sz="4"/>
-              <w:right w:val="single" w:color="B0B8C4" w:sz="4"/>
-            </w:tcBorders>
-            <w:tcMar>
-              <w:top w:type="dxa" w:w="60"/>
-              <w:left w:type="dxa" w:w="100"/>
-              <w:bottom w:type="dxa" w:w="60"/>
-              <w:right w:type="dxa" w:w="100"/>
-            </w:tcMar>
-          </w:tcPr>
-          <w:p>
-            <w:r>
-              <w:rPr>
-                <w:b w:val="false"/>
-                <w:bCs w:val="false"/>
-                <w:i w:val="false"/>
-                <w:iCs w:val="false"/>
-                <w:sz w:val="20"/>
-                <w:szCs w:val="20"/>
-              </w:rPr>
-              <w:t xml:space="preserve"/>
-            </w:r>
-          </w:p>
-        </w:tc>
-        <w:tc>
-          <w:tcPr>
-            <w:tcW w:type="dxa" w:w="2026"/>
+            <w:tcW w:type="dxa" w:w="2000"/>
+            <w:tcBorders>
+              <w:top w:val="single" w:color="B0B8C4" w:sz="4"/>
+              <w:left w:val="single" w:color="B0B8C4" w:sz="4"/>
+              <w:bottom w:val="single" w:color="B0B8C4" w:sz="4"/>
+              <w:right w:val="single" w:color="B0B8C4" w:sz="4"/>
+            </w:tcBorders>
+            <w:tcMar>
+              <w:top w:type="dxa" w:w="60"/>
+              <w:left w:type="dxa" w:w="100"/>
+              <w:bottom w:type="dxa" w:w="60"/>
+              <w:right w:type="dxa" w:w="100"/>
+            </w:tcMar>
+          </w:tcPr>
+          <w:p>
+            <w:r>
+              <w:rPr>
+                <w:b w:val="false"/>
+                <w:bCs w:val="false"/>
+                <w:i w:val="false"/>
+                <w:iCs w:val="false"/>
+                <w:sz w:val="20"/>
+                <w:szCs w:val="20"/>
+              </w:rPr>
+              <w:t xml:space="preserve"/>
+            </w:r>
+          </w:p>
+        </w:tc>
+        <w:tc>
+          <w:tcPr>
+            <w:tcW w:type="dxa" w:w="1800"/>
+            <w:tcBorders>
+              <w:top w:val="single" w:color="B0B8C4" w:sz="4"/>
+              <w:left w:val="single" w:color="B0B8C4" w:sz="4"/>
+              <w:bottom w:val="single" w:color="B0B8C4" w:sz="4"/>
+              <w:right w:val="single" w:color="B0B8C4" w:sz="4"/>
+            </w:tcBorders>
+            <w:tcMar>
+              <w:top w:type="dxa" w:w="60"/>
+              <w:left w:type="dxa" w:w="100"/>
+              <w:bottom w:type="dxa" w:w="60"/>
+              <w:right w:type="dxa" w:w="100"/>
+            </w:tcMar>
+          </w:tcPr>
+          <w:p>
+            <w:r>
+              <w:rPr>
+                <w:b w:val="false"/>
+                <w:bCs w:val="false"/>
+                <w:i w:val="false"/>
+                <w:iCs w:val="false"/>
+                <w:sz w:val="20"/>
+                <w:szCs w:val="20"/>
+              </w:rPr>
+              <w:t xml:space="preserve"/>
+            </w:r>
+          </w:p>
+        </w:tc>
+        <w:tc>
+          <w:tcPr>
+            <w:tcW w:type="dxa" w:w="1800"/>
+            <w:tcBorders>
+              <w:top w:val="single" w:color="B0B8C4" w:sz="4"/>
+              <w:left w:val="single" w:color="B0B8C4" w:sz="4"/>
+              <w:bottom w:val="single" w:color="B0B8C4" w:sz="4"/>
+              <w:right w:val="single" w:color="B0B8C4" w:sz="4"/>
+            </w:tcBorders>
+            <w:tcMar>
+              <w:top w:type="dxa" w:w="60"/>
+              <w:left w:type="dxa" w:w="100"/>
+              <w:bottom w:type="dxa" w:w="60"/>
+              <w:right w:type="dxa" w:w="100"/>
+            </w:tcMar>
+          </w:tcPr>
+          <w:p>
+            <w:r>
+              <w:rPr>
+                <w:b w:val="false"/>
+                <w:bCs w:val="false"/>
+                <w:i w:val="false"/>
+                <w:iCs w:val="false"/>
+                <w:sz w:val="20"/>
+                <w:szCs w:val="20"/>
+              </w:rPr>
+              <w:t xml:space="preserve"/>
+            </w:r>
+          </w:p>
+        </w:tc>
+        <w:tc>
+          <w:tcPr>
+            <w:tcW w:type="dxa" w:w="1800"/>
+            <w:tcBorders>
+              <w:top w:val="single" w:color="B0B8C4" w:sz="4"/>
+              <w:left w:val="single" w:color="B0B8C4" w:sz="4"/>
+              <w:bottom w:val="single" w:color="B0B8C4" w:sz="4"/>
+              <w:right w:val="single" w:color="B0B8C4" w:sz="4"/>
+            </w:tcBorders>
+            <w:tcMar>
+              <w:top w:type="dxa" w:w="60"/>
+              <w:left w:type="dxa" w:w="100"/>
+              <w:bottom w:type="dxa" w:w="60"/>
+              <w:right w:type="dxa" w:w="100"/>
+            </w:tcMar>
+          </w:tcPr>
+          <w:p>
+            <w:r>
+              <w:rPr>
+                <w:b w:val="false"/>
+                <w:bCs w:val="false"/>
+                <w:i w:val="false"/>
+                <w:iCs w:val="false"/>
+                <w:sz w:val="20"/>
+                <w:szCs w:val="20"/>
+              </w:rPr>
+              <w:t xml:space="preserve"/>
+            </w:r>
+          </w:p>
+        </w:tc>
+        <w:tc>
+          <w:tcPr>
+            <w:tcW w:type="dxa" w:w="1626"/>
             <w:tcBorders>
               <w:top w:val="single" w:color="B0B8C4" w:sz="4"/>
               <w:left w:val="single" w:color="B0B8C4" w:sz="4"/>
@@ -2338,97 +2474,127 @@
       <w:tr>
         <w:tc>
           <w:tcPr>
-            <w:tcW w:type="dxa" w:w="2400"/>
-            <w:tcBorders>
-              <w:top w:val="single" w:color="B0B8C4" w:sz="4"/>
-              <w:left w:val="single" w:color="B0B8C4" w:sz="4"/>
-              <w:bottom w:val="single" w:color="B0B8C4" w:sz="4"/>
-              <w:right w:val="single" w:color="B0B8C4" w:sz="4"/>
-            </w:tcBorders>
-            <w:tcMar>
-              <w:top w:type="dxa" w:w="60"/>
-              <w:left w:type="dxa" w:w="100"/>
-              <w:bottom w:type="dxa" w:w="60"/>
-              <w:right w:type="dxa" w:w="100"/>
-            </w:tcMar>
-          </w:tcPr>
-          <w:p>
-            <w:r>
-              <w:rPr>
-                <w:b w:val="false"/>
-                <w:bCs w:val="false"/>
-                <w:i w:val="false"/>
-                <w:iCs w:val="false"/>
-                <w:sz w:val="20"/>
-                <w:szCs w:val="20"/>
-              </w:rPr>
-              <w:t xml:space="preserve"/>
-            </w:r>
-          </w:p>
-        </w:tc>
-        <w:tc>
-          <w:tcPr>
-            <w:tcW w:type="dxa" w:w="2300"/>
-            <w:tcBorders>
-              <w:top w:val="single" w:color="B0B8C4" w:sz="4"/>
-              <w:left w:val="single" w:color="B0B8C4" w:sz="4"/>
-              <w:bottom w:val="single" w:color="B0B8C4" w:sz="4"/>
-              <w:right w:val="single" w:color="B0B8C4" w:sz="4"/>
-            </w:tcBorders>
-            <w:tcMar>
-              <w:top w:type="dxa" w:w="60"/>
-              <w:left w:type="dxa" w:w="100"/>
-              <w:bottom w:type="dxa" w:w="60"/>
-              <w:right w:type="dxa" w:w="100"/>
-            </w:tcMar>
-          </w:tcPr>
-          <w:p>
-            <w:r>
-              <w:rPr>
-                <w:b w:val="false"/>
-                <w:bCs w:val="false"/>
-                <w:i w:val="false"/>
-                <w:iCs w:val="false"/>
-                <w:sz w:val="20"/>
-                <w:szCs w:val="20"/>
-              </w:rPr>
-              <w:t xml:space="preserve"/>
-            </w:r>
-          </w:p>
-        </w:tc>
-        <w:tc>
-          <w:tcPr>
-            <w:tcW w:type="dxa" w:w="2300"/>
-            <w:tcBorders>
-              <w:top w:val="single" w:color="B0B8C4" w:sz="4"/>
-              <w:left w:val="single" w:color="B0B8C4" w:sz="4"/>
-              <w:bottom w:val="single" w:color="B0B8C4" w:sz="4"/>
-              <w:right w:val="single" w:color="B0B8C4" w:sz="4"/>
-            </w:tcBorders>
-            <w:tcMar>
-              <w:top w:type="dxa" w:w="60"/>
-              <w:left w:type="dxa" w:w="100"/>
-              <w:bottom w:type="dxa" w:w="60"/>
-              <w:right w:type="dxa" w:w="100"/>
-            </w:tcMar>
-          </w:tcPr>
-          <w:p>
-            <w:r>
-              <w:rPr>
-                <w:b w:val="false"/>
-                <w:bCs w:val="false"/>
-                <w:i w:val="false"/>
-                <w:iCs w:val="false"/>
-                <w:sz w:val="20"/>
-                <w:szCs w:val="20"/>
-              </w:rPr>
-              <w:t xml:space="preserve"/>
-            </w:r>
-          </w:p>
-        </w:tc>
-        <w:tc>
-          <w:tcPr>
-            <w:tcW w:type="dxa" w:w="2026"/>
+            <w:tcW w:type="dxa" w:w="2000"/>
+            <w:tcBorders>
+              <w:top w:val="single" w:color="B0B8C4" w:sz="4"/>
+              <w:left w:val="single" w:color="B0B8C4" w:sz="4"/>
+              <w:bottom w:val="single" w:color="B0B8C4" w:sz="4"/>
+              <w:right w:val="single" w:color="B0B8C4" w:sz="4"/>
+            </w:tcBorders>
+            <w:tcMar>
+              <w:top w:type="dxa" w:w="60"/>
+              <w:left w:type="dxa" w:w="100"/>
+              <w:bottom w:type="dxa" w:w="60"/>
+              <w:right w:type="dxa" w:w="100"/>
+            </w:tcMar>
+          </w:tcPr>
+          <w:p>
+            <w:r>
+              <w:rPr>
+                <w:b w:val="false"/>
+                <w:bCs w:val="false"/>
+                <w:i w:val="false"/>
+                <w:iCs w:val="false"/>
+                <w:sz w:val="20"/>
+                <w:szCs w:val="20"/>
+              </w:rPr>
+              <w:t xml:space="preserve"/>
+            </w:r>
+          </w:p>
+        </w:tc>
+        <w:tc>
+          <w:tcPr>
+            <w:tcW w:type="dxa" w:w="1800"/>
+            <w:tcBorders>
+              <w:top w:val="single" w:color="B0B8C4" w:sz="4"/>
+              <w:left w:val="single" w:color="B0B8C4" w:sz="4"/>
+              <w:bottom w:val="single" w:color="B0B8C4" w:sz="4"/>
+              <w:right w:val="single" w:color="B0B8C4" w:sz="4"/>
+            </w:tcBorders>
+            <w:tcMar>
+              <w:top w:type="dxa" w:w="60"/>
+              <w:left w:type="dxa" w:w="100"/>
+              <w:bottom w:type="dxa" w:w="60"/>
+              <w:right w:type="dxa" w:w="100"/>
+            </w:tcMar>
+          </w:tcPr>
+          <w:p>
+            <w:r>
+              <w:rPr>
+                <w:b w:val="false"/>
+                <w:bCs w:val="false"/>
+                <w:i w:val="false"/>
+                <w:iCs w:val="false"/>
+                <w:sz w:val="20"/>
+                <w:szCs w:val="20"/>
+              </w:rPr>
+              <w:t xml:space="preserve"/>
+            </w:r>
+          </w:p>
+        </w:tc>
+        <w:tc>
+          <w:tcPr>
+            <w:tcW w:type="dxa" w:w="1800"/>
+            <w:tcBorders>
+              <w:top w:val="single" w:color="B0B8C4" w:sz="4"/>
+              <w:left w:val="single" w:color="B0B8C4" w:sz="4"/>
+              <w:bottom w:val="single" w:color="B0B8C4" w:sz="4"/>
+              <w:right w:val="single" w:color="B0B8C4" w:sz="4"/>
+            </w:tcBorders>
+            <w:tcMar>
+              <w:top w:type="dxa" w:w="60"/>
+              <w:left w:type="dxa" w:w="100"/>
+              <w:bottom w:type="dxa" w:w="60"/>
+              <w:right w:type="dxa" w:w="100"/>
+            </w:tcMar>
+          </w:tcPr>
+          <w:p>
+            <w:r>
+              <w:rPr>
+                <w:b w:val="false"/>
+                <w:bCs w:val="false"/>
+                <w:i w:val="false"/>
+                <w:iCs w:val="false"/>
+                <w:sz w:val="20"/>
+                <w:szCs w:val="20"/>
+              </w:rPr>
+              <w:t xml:space="preserve"/>
+            </w:r>
+          </w:p>
+        </w:tc>
+        <w:tc>
+          <w:tcPr>
+            <w:tcW w:type="dxa" w:w="1800"/>
+            <w:tcBorders>
+              <w:top w:val="single" w:color="B0B8C4" w:sz="4"/>
+              <w:left w:val="single" w:color="B0B8C4" w:sz="4"/>
+              <w:bottom w:val="single" w:color="B0B8C4" w:sz="4"/>
+              <w:right w:val="single" w:color="B0B8C4" w:sz="4"/>
+            </w:tcBorders>
+            <w:tcMar>
+              <w:top w:type="dxa" w:w="60"/>
+              <w:left w:type="dxa" w:w="100"/>
+              <w:bottom w:type="dxa" w:w="60"/>
+              <w:right w:type="dxa" w:w="100"/>
+            </w:tcMar>
+          </w:tcPr>
+          <w:p>
+            <w:r>
+              <w:rPr>
+                <w:b w:val="false"/>
+                <w:bCs w:val="false"/>
+                <w:i w:val="false"/>
+                <w:iCs w:val="false"/>
+                <w:sz w:val="20"/>
+                <w:szCs w:val="20"/>
+              </w:rPr>
+              <w:t xml:space="preserve"/>
+            </w:r>
+          </w:p>
+        </w:tc>
+        <w:tc>
+          <w:tcPr>
+            <w:tcW w:type="dxa" w:w="1626"/>
             <w:tcBorders>
               <w:top w:val="single" w:color="B0B8C4" w:sz="4"/>
               <w:left w:val="single" w:color="B0B8C4" w:sz="4"/>
@@ -2460,97 +2626,127 @@
       <w:tr>
         <w:tc>
           <w:tcPr>
-            <w:tcW w:type="dxa" w:w="2400"/>
-            <w:tcBorders>
-              <w:top w:val="single" w:color="B0B8C4" w:sz="4"/>
-              <w:left w:val="single" w:color="B0B8C4" w:sz="4"/>
-              <w:bottom w:val="single" w:color="B0B8C4" w:sz="4"/>
-              <w:right w:val="single" w:color="B0B8C4" w:sz="4"/>
-            </w:tcBorders>
-            <w:tcMar>
-              <w:top w:type="dxa" w:w="60"/>
-              <w:left w:type="dxa" w:w="100"/>
-              <w:bottom w:type="dxa" w:w="60"/>
-              <w:right w:type="dxa" w:w="100"/>
-            </w:tcMar>
-          </w:tcPr>
-          <w:p>
-            <w:r>
-              <w:rPr>
-                <w:b w:val="false"/>
-                <w:bCs w:val="false"/>
-                <w:i w:val="false"/>
-                <w:iCs w:val="false"/>
-                <w:sz w:val="20"/>
-                <w:szCs w:val="20"/>
-              </w:rPr>
-              <w:t xml:space="preserve"/>
-            </w:r>
-          </w:p>
-        </w:tc>
-        <w:tc>
-          <w:tcPr>
-            <w:tcW w:type="dxa" w:w="2300"/>
-            <w:tcBorders>
-              <w:top w:val="single" w:color="B0B8C4" w:sz="4"/>
-              <w:left w:val="single" w:color="B0B8C4" w:sz="4"/>
-              <w:bottom w:val="single" w:color="B0B8C4" w:sz="4"/>
-              <w:right w:val="single" w:color="B0B8C4" w:sz="4"/>
-            </w:tcBorders>
-            <w:tcMar>
-              <w:top w:type="dxa" w:w="60"/>
-              <w:left w:type="dxa" w:w="100"/>
-              <w:bottom w:type="dxa" w:w="60"/>
-              <w:right w:type="dxa" w:w="100"/>
-            </w:tcMar>
-          </w:tcPr>
-          <w:p>
-            <w:r>
-              <w:rPr>
-                <w:b w:val="false"/>
-                <w:bCs w:val="false"/>
-                <w:i w:val="false"/>
-                <w:iCs w:val="false"/>
-                <w:sz w:val="20"/>
-                <w:szCs w:val="20"/>
-              </w:rPr>
-              <w:t xml:space="preserve"/>
-            </w:r>
-          </w:p>
-        </w:tc>
-        <w:tc>
-          <w:tcPr>
-            <w:tcW w:type="dxa" w:w="2300"/>
-            <w:tcBorders>
-              <w:top w:val="single" w:color="B0B8C4" w:sz="4"/>
-              <w:left w:val="single" w:color="B0B8C4" w:sz="4"/>
-              <w:bottom w:val="single" w:color="B0B8C4" w:sz="4"/>
-              <w:right w:val="single" w:color="B0B8C4" w:sz="4"/>
-            </w:tcBorders>
-            <w:tcMar>
-              <w:top w:type="dxa" w:w="60"/>
-              <w:left w:type="dxa" w:w="100"/>
-              <w:bottom w:type="dxa" w:w="60"/>
-              <w:right w:type="dxa" w:w="100"/>
-            </w:tcMar>
-          </w:tcPr>
-          <w:p>
-            <w:r>
-              <w:rPr>
-                <w:b w:val="false"/>
-                <w:bCs w:val="false"/>
-                <w:i w:val="false"/>
-                <w:iCs w:val="false"/>
-                <w:sz w:val="20"/>
-                <w:szCs w:val="20"/>
-              </w:rPr>
-              <w:t xml:space="preserve"/>
-            </w:r>
-          </w:p>
-        </w:tc>
-        <w:tc>
-          <w:tcPr>
-            <w:tcW w:type="dxa" w:w="2026"/>
+            <w:tcW w:type="dxa" w:w="2000"/>
+            <w:tcBorders>
+              <w:top w:val="single" w:color="B0B8C4" w:sz="4"/>
+              <w:left w:val="single" w:color="B0B8C4" w:sz="4"/>
+              <w:bottom w:val="single" w:color="B0B8C4" w:sz="4"/>
+              <w:right w:val="single" w:color="B0B8C4" w:sz="4"/>
+            </w:tcBorders>
+            <w:tcMar>
+              <w:top w:type="dxa" w:w="60"/>
+              <w:left w:type="dxa" w:w="100"/>
+              <w:bottom w:type="dxa" w:w="60"/>
+              <w:right w:type="dxa" w:w="100"/>
+            </w:tcMar>
+          </w:tcPr>
+          <w:p>
+            <w:r>
+              <w:rPr>
+                <w:b w:val="false"/>
+                <w:bCs w:val="false"/>
+                <w:i w:val="false"/>
+                <w:iCs w:val="false"/>
+                <w:sz w:val="20"/>
+                <w:szCs w:val="20"/>
+              </w:rPr>
+              <w:t xml:space="preserve"/>
+            </w:r>
+          </w:p>
+        </w:tc>
+        <w:tc>
+          <w:tcPr>
+            <w:tcW w:type="dxa" w:w="1800"/>
+            <w:tcBorders>
+              <w:top w:val="single" w:color="B0B8C4" w:sz="4"/>
+              <w:left w:val="single" w:color="B0B8C4" w:sz="4"/>
+              <w:bottom w:val="single" w:color="B0B8C4" w:sz="4"/>
+              <w:right w:val="single" w:color="B0B8C4" w:sz="4"/>
+            </w:tcBorders>
+            <w:tcMar>
+              <w:top w:type="dxa" w:w="60"/>
+              <w:left w:type="dxa" w:w="100"/>
+              <w:bottom w:type="dxa" w:w="60"/>
+              <w:right w:type="dxa" w:w="100"/>
+            </w:tcMar>
+          </w:tcPr>
+          <w:p>
+            <w:r>
+              <w:rPr>
+                <w:b w:val="false"/>
+                <w:bCs w:val="false"/>
+                <w:i w:val="false"/>
+                <w:iCs w:val="false"/>
+                <w:sz w:val="20"/>
+                <w:szCs w:val="20"/>
+              </w:rPr>
+              <w:t xml:space="preserve"/>
+            </w:r>
+          </w:p>
+        </w:tc>
+        <w:tc>
+          <w:tcPr>
+            <w:tcW w:type="dxa" w:w="1800"/>
+            <w:tcBorders>
+              <w:top w:val="single" w:color="B0B8C4" w:sz="4"/>
+              <w:left w:val="single" w:color="B0B8C4" w:sz="4"/>
+              <w:bottom w:val="single" w:color="B0B8C4" w:sz="4"/>
+              <w:right w:val="single" w:color="B0B8C4" w:sz="4"/>
+            </w:tcBorders>
+            <w:tcMar>
+              <w:top w:type="dxa" w:w="60"/>
+              <w:left w:type="dxa" w:w="100"/>
+              <w:bottom w:type="dxa" w:w="60"/>
+              <w:right w:type="dxa" w:w="100"/>
+            </w:tcMar>
+          </w:tcPr>
+          <w:p>
+            <w:r>
+              <w:rPr>
+                <w:b w:val="false"/>
+                <w:bCs w:val="false"/>
+                <w:i w:val="false"/>
+                <w:iCs w:val="false"/>
+                <w:sz w:val="20"/>
+                <w:szCs w:val="20"/>
+              </w:rPr>
+              <w:t xml:space="preserve"/>
+            </w:r>
+          </w:p>
+        </w:tc>
+        <w:tc>
+          <w:tcPr>
+            <w:tcW w:type="dxa" w:w="1800"/>
+            <w:tcBorders>
+              <w:top w:val="single" w:color="B0B8C4" w:sz="4"/>
+              <w:left w:val="single" w:color="B0B8C4" w:sz="4"/>
+              <w:bottom w:val="single" w:color="B0B8C4" w:sz="4"/>
+              <w:right w:val="single" w:color="B0B8C4" w:sz="4"/>
+            </w:tcBorders>
+            <w:tcMar>
+              <w:top w:type="dxa" w:w="60"/>
+              <w:left w:type="dxa" w:w="100"/>
+              <w:bottom w:type="dxa" w:w="60"/>
+              <w:right w:type="dxa" w:w="100"/>
+            </w:tcMar>
+          </w:tcPr>
+          <w:p>
+            <w:r>
+              <w:rPr>
+                <w:b w:val="false"/>
+                <w:bCs w:val="false"/>
+                <w:i w:val="false"/>
+                <w:iCs w:val="false"/>
+                <w:sz w:val="20"/>
+                <w:szCs w:val="20"/>
+              </w:rPr>
+              <w:t xml:space="preserve"/>
+            </w:r>
+          </w:p>
+        </w:tc>
+        <w:tc>
+          <w:tcPr>
+            <w:tcW w:type="dxa" w:w="1626"/>
             <w:tcBorders>
               <w:top w:val="single" w:color="B0B8C4" w:sz="4"/>
               <w:left w:val="single" w:color="B0B8C4" w:sz="4"/>
@@ -2582,97 +2778,127 @@
       <w:tr>
         <w:tc>
           <w:tcPr>
-            <w:tcW w:type="dxa" w:w="2400"/>
-            <w:tcBorders>
-              <w:top w:val="single" w:color="B0B8C4" w:sz="4"/>
-              <w:left w:val="single" w:color="B0B8C4" w:sz="4"/>
-              <w:bottom w:val="single" w:color="B0B8C4" w:sz="4"/>
-              <w:right w:val="single" w:color="B0B8C4" w:sz="4"/>
-            </w:tcBorders>
-            <w:tcMar>
-              <w:top w:type="dxa" w:w="60"/>
-              <w:left w:type="dxa" w:w="100"/>
-              <w:bottom w:type="dxa" w:w="60"/>
-              <w:right w:type="dxa" w:w="100"/>
-            </w:tcMar>
-          </w:tcPr>
-          <w:p>
-            <w:r>
-              <w:rPr>
-                <w:b w:val="false"/>
-                <w:bCs w:val="false"/>
-                <w:i w:val="false"/>
-                <w:iCs w:val="false"/>
-                <w:sz w:val="20"/>
-                <w:szCs w:val="20"/>
-              </w:rPr>
-              <w:t xml:space="preserve"/>
-            </w:r>
-          </w:p>
-        </w:tc>
-        <w:tc>
-          <w:tcPr>
-            <w:tcW w:type="dxa" w:w="2300"/>
-            <w:tcBorders>
-              <w:top w:val="single" w:color="B0B8C4" w:sz="4"/>
-              <w:left w:val="single" w:color="B0B8C4" w:sz="4"/>
-              <w:bottom w:val="single" w:color="B0B8C4" w:sz="4"/>
-              <w:right w:val="single" w:color="B0B8C4" w:sz="4"/>
-            </w:tcBorders>
-            <w:tcMar>
-              <w:top w:type="dxa" w:w="60"/>
-              <w:left w:type="dxa" w:w="100"/>
-              <w:bottom w:type="dxa" w:w="60"/>
-              <w:right w:type="dxa" w:w="100"/>
-            </w:tcMar>
-          </w:tcPr>
-          <w:p>
-            <w:r>
-              <w:rPr>
-                <w:b w:val="false"/>
-                <w:bCs w:val="false"/>
-                <w:i w:val="false"/>
-                <w:iCs w:val="false"/>
-                <w:sz w:val="20"/>
-                <w:szCs w:val="20"/>
-              </w:rPr>
-              <w:t xml:space="preserve"/>
-            </w:r>
-          </w:p>
-        </w:tc>
-        <w:tc>
-          <w:tcPr>
-            <w:tcW w:type="dxa" w:w="2300"/>
-            <w:tcBorders>
-              <w:top w:val="single" w:color="B0B8C4" w:sz="4"/>
-              <w:left w:val="single" w:color="B0B8C4" w:sz="4"/>
-              <w:bottom w:val="single" w:color="B0B8C4" w:sz="4"/>
-              <w:right w:val="single" w:color="B0B8C4" w:sz="4"/>
-            </w:tcBorders>
-            <w:tcMar>
-              <w:top w:type="dxa" w:w="60"/>
-              <w:left w:type="dxa" w:w="100"/>
-              <w:bottom w:type="dxa" w:w="60"/>
-              <w:right w:type="dxa" w:w="100"/>
-            </w:tcMar>
-          </w:tcPr>
-          <w:p>
-            <w:r>
-              <w:rPr>
-                <w:b w:val="false"/>
-                <w:bCs w:val="false"/>
-                <w:i w:val="false"/>
-                <w:iCs w:val="false"/>
-                <w:sz w:val="20"/>
-                <w:szCs w:val="20"/>
-              </w:rPr>
-              <w:t xml:space="preserve"/>
-            </w:r>
-          </w:p>
-        </w:tc>
-        <w:tc>
-          <w:tcPr>
-            <w:tcW w:type="dxa" w:w="2026"/>
+            <w:tcW w:type="dxa" w:w="2000"/>
+            <w:tcBorders>
+              <w:top w:val="single" w:color="B0B8C4" w:sz="4"/>
+              <w:left w:val="single" w:color="B0B8C4" w:sz="4"/>
+              <w:bottom w:val="single" w:color="B0B8C4" w:sz="4"/>
+              <w:right w:val="single" w:color="B0B8C4" w:sz="4"/>
+            </w:tcBorders>
+            <w:tcMar>
+              <w:top w:type="dxa" w:w="60"/>
+              <w:left w:type="dxa" w:w="100"/>
+              <w:bottom w:type="dxa" w:w="60"/>
+              <w:right w:type="dxa" w:w="100"/>
+            </w:tcMar>
+          </w:tcPr>
+          <w:p>
+            <w:r>
+              <w:rPr>
+                <w:b w:val="false"/>
+                <w:bCs w:val="false"/>
+                <w:i w:val="false"/>
+                <w:iCs w:val="false"/>
+                <w:sz w:val="20"/>
+                <w:szCs w:val="20"/>
+              </w:rPr>
+              <w:t xml:space="preserve"/>
+            </w:r>
+          </w:p>
+        </w:tc>
+        <w:tc>
+          <w:tcPr>
+            <w:tcW w:type="dxa" w:w="1800"/>
+            <w:tcBorders>
+              <w:top w:val="single" w:color="B0B8C4" w:sz="4"/>
+              <w:left w:val="single" w:color="B0B8C4" w:sz="4"/>
+              <w:bottom w:val="single" w:color="B0B8C4" w:sz="4"/>
+              <w:right w:val="single" w:color="B0B8C4" w:sz="4"/>
+            </w:tcBorders>
+            <w:tcMar>
+              <w:top w:type="dxa" w:w="60"/>
+              <w:left w:type="dxa" w:w="100"/>
+              <w:bottom w:type="dxa" w:w="60"/>
+              <w:right w:type="dxa" w:w="100"/>
+            </w:tcMar>
+          </w:tcPr>
+          <w:p>
+            <w:r>
+              <w:rPr>
+                <w:b w:val="false"/>
+                <w:bCs w:val="false"/>
+                <w:i w:val="false"/>
+                <w:iCs w:val="false"/>
+                <w:sz w:val="20"/>
+                <w:szCs w:val="20"/>
+              </w:rPr>
+              <w:t xml:space="preserve"/>
+            </w:r>
+          </w:p>
+        </w:tc>
+        <w:tc>
+          <w:tcPr>
+            <w:tcW w:type="dxa" w:w="1800"/>
+            <w:tcBorders>
+              <w:top w:val="single" w:color="B0B8C4" w:sz="4"/>
+              <w:left w:val="single" w:color="B0B8C4" w:sz="4"/>
+              <w:bottom w:val="single" w:color="B0B8C4" w:sz="4"/>
+              <w:right w:val="single" w:color="B0B8C4" w:sz="4"/>
+            </w:tcBorders>
+            <w:tcMar>
+              <w:top w:type="dxa" w:w="60"/>
+              <w:left w:type="dxa" w:w="100"/>
+              <w:bottom w:type="dxa" w:w="60"/>
+              <w:right w:type="dxa" w:w="100"/>
+            </w:tcMar>
+          </w:tcPr>
+          <w:p>
+            <w:r>
+              <w:rPr>
+                <w:b w:val="false"/>
+                <w:bCs w:val="false"/>
+                <w:i w:val="false"/>
+                <w:iCs w:val="false"/>
+                <w:sz w:val="20"/>
+                <w:szCs w:val="20"/>
+              </w:rPr>
+              <w:t xml:space="preserve"/>
+            </w:r>
+          </w:p>
+        </w:tc>
+        <w:tc>
+          <w:tcPr>
+            <w:tcW w:type="dxa" w:w="1800"/>
+            <w:tcBorders>
+              <w:top w:val="single" w:color="B0B8C4" w:sz="4"/>
+              <w:left w:val="single" w:color="B0B8C4" w:sz="4"/>
+              <w:bottom w:val="single" w:color="B0B8C4" w:sz="4"/>
+              <w:right w:val="single" w:color="B0B8C4" w:sz="4"/>
+            </w:tcBorders>
+            <w:tcMar>
+              <w:top w:type="dxa" w:w="60"/>
+              <w:left w:type="dxa" w:w="100"/>
+              <w:bottom w:type="dxa" w:w="60"/>
+              <w:right w:type="dxa" w:w="100"/>
+            </w:tcMar>
+          </w:tcPr>
+          <w:p>
+            <w:r>
+              <w:rPr>
+                <w:b w:val="false"/>
+                <w:bCs w:val="false"/>
+                <w:i w:val="false"/>
+                <w:iCs w:val="false"/>
+                <w:sz w:val="20"/>
+                <w:szCs w:val="20"/>
+              </w:rPr>
+              <w:t xml:space="preserve"/>
+            </w:r>
+          </w:p>
+        </w:tc>
+        <w:tc>
+          <w:tcPr>
+            <w:tcW w:type="dxa" w:w="1626"/>
             <w:tcBorders>
               <w:top w:val="single" w:color="B0B8C4" w:sz="4"/>
               <w:left w:val="single" w:color="B0B8C4" w:sz="4"/>
@@ -2704,97 +2930,127 @@
       <w:tr>
         <w:tc>
           <w:tcPr>
-            <w:tcW w:type="dxa" w:w="2400"/>
-            <w:tcBorders>
-              <w:top w:val="single" w:color="B0B8C4" w:sz="4"/>
-              <w:left w:val="single" w:color="B0B8C4" w:sz="4"/>
-              <w:bottom w:val="single" w:color="B0B8C4" w:sz="4"/>
-              <w:right w:val="single" w:color="B0B8C4" w:sz="4"/>
-            </w:tcBorders>
-            <w:tcMar>
-              <w:top w:type="dxa" w:w="60"/>
-              <w:left w:type="dxa" w:w="100"/>
-              <w:bottom w:type="dxa" w:w="60"/>
-              <w:right w:type="dxa" w:w="100"/>
-            </w:tcMar>
-          </w:tcPr>
-          <w:p>
-            <w:r>
-              <w:rPr>
-                <w:b w:val="false"/>
-                <w:bCs w:val="false"/>
-                <w:i w:val="false"/>
-                <w:iCs w:val="false"/>
-                <w:sz w:val="20"/>
-                <w:szCs w:val="20"/>
-              </w:rPr>
-              <w:t xml:space="preserve"/>
-            </w:r>
-          </w:p>
-        </w:tc>
-        <w:tc>
-          <w:tcPr>
-            <w:tcW w:type="dxa" w:w="2300"/>
-            <w:tcBorders>
-              <w:top w:val="single" w:color="B0B8C4" w:sz="4"/>
-              <w:left w:val="single" w:color="B0B8C4" w:sz="4"/>
-              <w:bottom w:val="single" w:color="B0B8C4" w:sz="4"/>
-              <w:right w:val="single" w:color="B0B8C4" w:sz="4"/>
-            </w:tcBorders>
-            <w:tcMar>
-              <w:top w:type="dxa" w:w="60"/>
-              <w:left w:type="dxa" w:w="100"/>
-              <w:bottom w:type="dxa" w:w="60"/>
-              <w:right w:type="dxa" w:w="100"/>
-            </w:tcMar>
-          </w:tcPr>
-          <w:p>
-            <w:r>
-              <w:rPr>
-                <w:b w:val="false"/>
-                <w:bCs w:val="false"/>
-                <w:i w:val="false"/>
-                <w:iCs w:val="false"/>
-                <w:sz w:val="20"/>
-                <w:szCs w:val="20"/>
-              </w:rPr>
-              <w:t xml:space="preserve"/>
-            </w:r>
-          </w:p>
-        </w:tc>
-        <w:tc>
-          <w:tcPr>
-            <w:tcW w:type="dxa" w:w="2300"/>
-            <w:tcBorders>
-              <w:top w:val="single" w:color="B0B8C4" w:sz="4"/>
-              <w:left w:val="single" w:color="B0B8C4" w:sz="4"/>
-              <w:bottom w:val="single" w:color="B0B8C4" w:sz="4"/>
-              <w:right w:val="single" w:color="B0B8C4" w:sz="4"/>
-            </w:tcBorders>
-            <w:tcMar>
-              <w:top w:type="dxa" w:w="60"/>
-              <w:left w:type="dxa" w:w="100"/>
-              <w:bottom w:type="dxa" w:w="60"/>
-              <w:right w:type="dxa" w:w="100"/>
-            </w:tcMar>
-          </w:tcPr>
-          <w:p>
-            <w:r>
-              <w:rPr>
-                <w:b w:val="false"/>
-                <w:bCs w:val="false"/>
-                <w:i w:val="false"/>
-                <w:iCs w:val="false"/>
-                <w:sz w:val="20"/>
-                <w:szCs w:val="20"/>
-              </w:rPr>
-              <w:t xml:space="preserve"/>
-            </w:r>
-          </w:p>
-        </w:tc>
-        <w:tc>
-          <w:tcPr>
-            <w:tcW w:type="dxa" w:w="2026"/>
+            <w:tcW w:type="dxa" w:w="2000"/>
+            <w:tcBorders>
+              <w:top w:val="single" w:color="B0B8C4" w:sz="4"/>
+              <w:left w:val="single" w:color="B0B8C4" w:sz="4"/>
+              <w:bottom w:val="single" w:color="B0B8C4" w:sz="4"/>
+              <w:right w:val="single" w:color="B0B8C4" w:sz="4"/>
+            </w:tcBorders>
+            <w:tcMar>
+              <w:top w:type="dxa" w:w="60"/>
+              <w:left w:type="dxa" w:w="100"/>
+              <w:bottom w:type="dxa" w:w="60"/>
+              <w:right w:type="dxa" w:w="100"/>
+            </w:tcMar>
+          </w:tcPr>
+          <w:p>
+            <w:r>
+              <w:rPr>
+                <w:b w:val="false"/>
+                <w:bCs w:val="false"/>
+                <w:i w:val="false"/>
+                <w:iCs w:val="false"/>
+                <w:sz w:val="20"/>
+                <w:szCs w:val="20"/>
+              </w:rPr>
+              <w:t xml:space="preserve"/>
+            </w:r>
+          </w:p>
+        </w:tc>
+        <w:tc>
+          <w:tcPr>
+            <w:tcW w:type="dxa" w:w="1800"/>
+            <w:tcBorders>
+              <w:top w:val="single" w:color="B0B8C4" w:sz="4"/>
+              <w:left w:val="single" w:color="B0B8C4" w:sz="4"/>
+              <w:bottom w:val="single" w:color="B0B8C4" w:sz="4"/>
+              <w:right w:val="single" w:color="B0B8C4" w:sz="4"/>
+            </w:tcBorders>
+            <w:tcMar>
+              <w:top w:type="dxa" w:w="60"/>
+              <w:left w:type="dxa" w:w="100"/>
+              <w:bottom w:type="dxa" w:w="60"/>
+              <w:right w:type="dxa" w:w="100"/>
+            </w:tcMar>
+          </w:tcPr>
+          <w:p>
+            <w:r>
+              <w:rPr>
+                <w:b w:val="false"/>
+                <w:bCs w:val="false"/>
+                <w:i w:val="false"/>
+                <w:iCs w:val="false"/>
+                <w:sz w:val="20"/>
+                <w:szCs w:val="20"/>
+              </w:rPr>
+              <w:t xml:space="preserve"/>
+            </w:r>
+          </w:p>
+        </w:tc>
+        <w:tc>
+          <w:tcPr>
+            <w:tcW w:type="dxa" w:w="1800"/>
+            <w:tcBorders>
+              <w:top w:val="single" w:color="B0B8C4" w:sz="4"/>
+              <w:left w:val="single" w:color="B0B8C4" w:sz="4"/>
+              <w:bottom w:val="single" w:color="B0B8C4" w:sz="4"/>
+              <w:right w:val="single" w:color="B0B8C4" w:sz="4"/>
+            </w:tcBorders>
+            <w:tcMar>
+              <w:top w:type="dxa" w:w="60"/>
+              <w:left w:type="dxa" w:w="100"/>
+              <w:bottom w:type="dxa" w:w="60"/>
+              <w:right w:type="dxa" w:w="100"/>
+            </w:tcMar>
+          </w:tcPr>
+          <w:p>
+            <w:r>
+              <w:rPr>
+                <w:b w:val="false"/>
+                <w:bCs w:val="false"/>
+                <w:i w:val="false"/>
+                <w:iCs w:val="false"/>
+                <w:sz w:val="20"/>
+                <w:szCs w:val="20"/>
+              </w:rPr>
+              <w:t xml:space="preserve"/>
+            </w:r>
+          </w:p>
+        </w:tc>
+        <w:tc>
+          <w:tcPr>
+            <w:tcW w:type="dxa" w:w="1800"/>
+            <w:tcBorders>
+              <w:top w:val="single" w:color="B0B8C4" w:sz="4"/>
+              <w:left w:val="single" w:color="B0B8C4" w:sz="4"/>
+              <w:bottom w:val="single" w:color="B0B8C4" w:sz="4"/>
+              <w:right w:val="single" w:color="B0B8C4" w:sz="4"/>
+            </w:tcBorders>
+            <w:tcMar>
+              <w:top w:type="dxa" w:w="60"/>
+              <w:left w:type="dxa" w:w="100"/>
+              <w:bottom w:type="dxa" w:w="60"/>
+              <w:right w:type="dxa" w:w="100"/>
+            </w:tcMar>
+          </w:tcPr>
+          <w:p>
+            <w:r>
+              <w:rPr>
+                <w:b w:val="false"/>
+                <w:bCs w:val="false"/>
+                <w:i w:val="false"/>
+                <w:iCs w:val="false"/>
+                <w:sz w:val="20"/>
+                <w:szCs w:val="20"/>
+              </w:rPr>
+              <w:t xml:space="preserve"/>
+            </w:r>
+          </w:p>
+        </w:tc>
+        <w:tc>
+          <w:tcPr>
+            <w:tcW w:type="dxa" w:w="1626"/>
             <w:tcBorders>
               <w:top w:val="single" w:color="B0B8C4" w:sz="4"/>
               <w:left w:val="single" w:color="B0B8C4" w:sz="4"/>
@@ -2826,97 +3082,127 @@
       <w:tr>
         <w:tc>
           <w:tcPr>
-            <w:tcW w:type="dxa" w:w="2400"/>
-            <w:tcBorders>
-              <w:top w:val="single" w:color="B0B8C4" w:sz="4"/>
-              <w:left w:val="single" w:color="B0B8C4" w:sz="4"/>
-              <w:bottom w:val="single" w:color="B0B8C4" w:sz="4"/>
-              <w:right w:val="single" w:color="B0B8C4" w:sz="4"/>
-            </w:tcBorders>
-            <w:tcMar>
-              <w:top w:type="dxa" w:w="60"/>
-              <w:left w:type="dxa" w:w="100"/>
-              <w:bottom w:type="dxa" w:w="60"/>
-              <w:right w:type="dxa" w:w="100"/>
-            </w:tcMar>
-          </w:tcPr>
-          <w:p>
-            <w:r>
-              <w:rPr>
-                <w:b w:val="false"/>
-                <w:bCs w:val="false"/>
-                <w:i w:val="false"/>
-                <w:iCs w:val="false"/>
-                <w:sz w:val="20"/>
-                <w:szCs w:val="20"/>
-              </w:rPr>
-              <w:t xml:space="preserve"/>
-            </w:r>
-          </w:p>
-        </w:tc>
-        <w:tc>
-          <w:tcPr>
-            <w:tcW w:type="dxa" w:w="2300"/>
-            <w:tcBorders>
-              <w:top w:val="single" w:color="B0B8C4" w:sz="4"/>
-              <w:left w:val="single" w:color="B0B8C4" w:sz="4"/>
-              <w:bottom w:val="single" w:color="B0B8C4" w:sz="4"/>
-              <w:right w:val="single" w:color="B0B8C4" w:sz="4"/>
-            </w:tcBorders>
-            <w:tcMar>
-              <w:top w:type="dxa" w:w="60"/>
-              <w:left w:type="dxa" w:w="100"/>
-              <w:bottom w:type="dxa" w:w="60"/>
-              <w:right w:type="dxa" w:w="100"/>
-            </w:tcMar>
-          </w:tcPr>
-          <w:p>
-            <w:r>
-              <w:rPr>
-                <w:b w:val="false"/>
-                <w:bCs w:val="false"/>
-                <w:i w:val="false"/>
-                <w:iCs w:val="false"/>
-                <w:sz w:val="20"/>
-                <w:szCs w:val="20"/>
-              </w:rPr>
-              <w:t xml:space="preserve"/>
-            </w:r>
-          </w:p>
-        </w:tc>
-        <w:tc>
-          <w:tcPr>
-            <w:tcW w:type="dxa" w:w="2300"/>
-            <w:tcBorders>
-              <w:top w:val="single" w:color="B0B8C4" w:sz="4"/>
-              <w:left w:val="single" w:color="B0B8C4" w:sz="4"/>
-              <w:bottom w:val="single" w:color="B0B8C4" w:sz="4"/>
-              <w:right w:val="single" w:color="B0B8C4" w:sz="4"/>
-            </w:tcBorders>
-            <w:tcMar>
-              <w:top w:type="dxa" w:w="60"/>
-              <w:left w:type="dxa" w:w="100"/>
-              <w:bottom w:type="dxa" w:w="60"/>
-              <w:right w:type="dxa" w:w="100"/>
-            </w:tcMar>
-          </w:tcPr>
-          <w:p>
-            <w:r>
-              <w:rPr>
-                <w:b w:val="false"/>
-                <w:bCs w:val="false"/>
-                <w:i w:val="false"/>
-                <w:iCs w:val="false"/>
-                <w:sz w:val="20"/>
-                <w:szCs w:val="20"/>
-              </w:rPr>
-              <w:t xml:space="preserve"/>
-            </w:r>
-          </w:p>
-        </w:tc>
-        <w:tc>
-          <w:tcPr>
-            <w:tcW w:type="dxa" w:w="2026"/>
+            <w:tcW w:type="dxa" w:w="2000"/>
+            <w:tcBorders>
+              <w:top w:val="single" w:color="B0B8C4" w:sz="4"/>
+              <w:left w:val="single" w:color="B0B8C4" w:sz="4"/>
+              <w:bottom w:val="single" w:color="B0B8C4" w:sz="4"/>
+              <w:right w:val="single" w:color="B0B8C4" w:sz="4"/>
+            </w:tcBorders>
+            <w:tcMar>
+              <w:top w:type="dxa" w:w="60"/>
+              <w:left w:type="dxa" w:w="100"/>
+              <w:bottom w:type="dxa" w:w="60"/>
+              <w:right w:type="dxa" w:w="100"/>
+            </w:tcMar>
+          </w:tcPr>
+          <w:p>
+            <w:r>
+              <w:rPr>
+                <w:b w:val="false"/>
+                <w:bCs w:val="false"/>
+                <w:i w:val="false"/>
+                <w:iCs w:val="false"/>
+                <w:sz w:val="20"/>
+                <w:szCs w:val="20"/>
+              </w:rPr>
+              <w:t xml:space="preserve"/>
+            </w:r>
+          </w:p>
+        </w:tc>
+        <w:tc>
+          <w:tcPr>
+            <w:tcW w:type="dxa" w:w="1800"/>
+            <w:tcBorders>
+              <w:top w:val="single" w:color="B0B8C4" w:sz="4"/>
+              <w:left w:val="single" w:color="B0B8C4" w:sz="4"/>
+              <w:bottom w:val="single" w:color="B0B8C4" w:sz="4"/>
+              <w:right w:val="single" w:color="B0B8C4" w:sz="4"/>
+            </w:tcBorders>
+            <w:tcMar>
+              <w:top w:type="dxa" w:w="60"/>
+              <w:left w:type="dxa" w:w="100"/>
+              <w:bottom w:type="dxa" w:w="60"/>
+              <w:right w:type="dxa" w:w="100"/>
+            </w:tcMar>
+          </w:tcPr>
+          <w:p>
+            <w:r>
+              <w:rPr>
+                <w:b w:val="false"/>
+                <w:bCs w:val="false"/>
+                <w:i w:val="false"/>
+                <w:iCs w:val="false"/>
+                <w:sz w:val="20"/>
+                <w:szCs w:val="20"/>
+              </w:rPr>
+              <w:t xml:space="preserve"/>
+            </w:r>
+          </w:p>
+        </w:tc>
+        <w:tc>
+          <w:tcPr>
+            <w:tcW w:type="dxa" w:w="1800"/>
+            <w:tcBorders>
+              <w:top w:val="single" w:color="B0B8C4" w:sz="4"/>
+              <w:left w:val="single" w:color="B0B8C4" w:sz="4"/>
+              <w:bottom w:val="single" w:color="B0B8C4" w:sz="4"/>
+              <w:right w:val="single" w:color="B0B8C4" w:sz="4"/>
+            </w:tcBorders>
+            <w:tcMar>
+              <w:top w:type="dxa" w:w="60"/>
+              <w:left w:type="dxa" w:w="100"/>
+              <w:bottom w:type="dxa" w:w="60"/>
+              <w:right w:type="dxa" w:w="100"/>
+            </w:tcMar>
+          </w:tcPr>
+          <w:p>
+            <w:r>
+              <w:rPr>
+                <w:b w:val="false"/>
+                <w:bCs w:val="false"/>
+                <w:i w:val="false"/>
+                <w:iCs w:val="false"/>
+                <w:sz w:val="20"/>
+                <w:szCs w:val="20"/>
+              </w:rPr>
+              <w:t xml:space="preserve"/>
+            </w:r>
+          </w:p>
+        </w:tc>
+        <w:tc>
+          <w:tcPr>
+            <w:tcW w:type="dxa" w:w="1800"/>
+            <w:tcBorders>
+              <w:top w:val="single" w:color="B0B8C4" w:sz="4"/>
+              <w:left w:val="single" w:color="B0B8C4" w:sz="4"/>
+              <w:bottom w:val="single" w:color="B0B8C4" w:sz="4"/>
+              <w:right w:val="single" w:color="B0B8C4" w:sz="4"/>
+            </w:tcBorders>
+            <w:tcMar>
+              <w:top w:type="dxa" w:w="60"/>
+              <w:left w:type="dxa" w:w="100"/>
+              <w:bottom w:type="dxa" w:w="60"/>
+              <w:right w:type="dxa" w:w="100"/>
+            </w:tcMar>
+          </w:tcPr>
+          <w:p>
+            <w:r>
+              <w:rPr>
+                <w:b w:val="false"/>
+                <w:bCs w:val="false"/>
+                <w:i w:val="false"/>
+                <w:iCs w:val="false"/>
+                <w:sz w:val="20"/>
+                <w:szCs w:val="20"/>
+              </w:rPr>
+              <w:t xml:space="preserve"/>
+            </w:r>
+          </w:p>
+        </w:tc>
+        <w:tc>
+          <w:tcPr>
+            <w:tcW w:type="dxa" w:w="1626"/>
             <w:tcBorders>
               <w:top w:val="single" w:color="B0B8C4" w:sz="4"/>
               <w:left w:val="single" w:color="B0B8C4" w:sz="4"/>
@@ -5533,6 +5819,26 @@
         <w:t xml:space="preserve">at an entry point: measure CEP-prompted recall in the same cells, before and at readout. Weak conversion and weak retrieval look the same in the outcome metric and need opposite fixes. Prompted recall is memory measurement, not stated preference — it is admissible.</w:t>
       </w:r>
     </w:p>
+    <w:p>
+      <w:pPr>
+        <w:pStyle w:val="ListParagraph"/>
+        <w:numPr>
+          <w:ilvl w:val="0"/>
+          <w:numId w:val="7"/>
+        </w:numPr>
+        <w:spacing w:after="80"/>
+      </w:pPr>
+      <w:r>
+        <w:rPr>
+          <w:b/>
+          <w:bCs/>
+        </w:rPr>
+        <w:t xml:space="preserve">Instrument the window for event-triggered mechanics: </w:t>
+      </w:r>
+      <w:r>
+        <w:t xml:space="preserve">record lead time per case — how far ahead of the customer's own search the offer landed. Count offers that arrived too late separately from offers that arrived and were declined. These are different failures with different fixes, and only the second one is about the offer. Note whether the pilot's latency was hand-worked; if it was, it does not yet prove the mechanic works at scale (I14).</w:t>
+      </w:r>
+    </w:p>
     <w:tbl>
       <w:tblPr>
         <w:tblW w:type="dxa" w:w="9026"/>
@@ -7805,7 +8111,7 @@
         <w:spacing w:after="80"/>
       </w:pPr>
       <w:r>
-        <w:t xml:space="preserve">Run the final lint in a NEW chat: attach the standard and the filled workbook; "Run lint rules I1-I13. Report each failure by rule number. Report only."</w:t>
+        <w:t xml:space="preserve">Run the final lint in a NEW chat: attach the standard and the filled workbook; "Run lint rules I1-I14. Report each failure by rule number. Report only."</w:t>
       </w:r>
     </w:p>
     <w:tbl>
@@ -7969,7 +8275,7 @@
                 <w:sz w:val="20"/>
                 <w:szCs w:val="20"/>
               </w:rPr>
-              <w:t xml:space="preserve">☐  The fresh-chat lint has run (I1-I13).</w:t>
+              <w:t xml:space="preserve">☐  The fresh-chat lint has run (I1-I14).</w:t>
             </w:r>
           </w:p>
         </w:tc>

</xml_diff>